<commit_message>
banner & dataviz height resize
</commit_message>
<xml_diff>
--- a/apl/doc/apl_cyril.docx
+++ b/apl/doc/apl_cyril.docx
@@ -5792,7 +5792,13 @@
         <w:t xml:space="preserve"> des </w:t>
       </w:r>
       <w:r>
-        <w:t>gynécologues :</w:t>
+        <w:t>gynécologues</w:t>
+      </w:r>
+      <w:r>
+        <w:t xml:space="preserve"> et des sage-femmes</w:t>
+      </w:r>
+      <w:r>
+        <w:t xml:space="preserve"> :</w:t>
       </w:r>
       <w:r>
         <w:t xml:space="preserve"> seule la population de</w:t>
@@ -5822,40 +5828,18 @@
     <w:p>
       <w:pPr>
         <w:jc w:val="both"/>
-        <w:rPr>
-          <w:kern w:val="0"/>
-          <w14:ligatures w14:val="none"/>
-        </w:rPr>
-      </w:pPr>
-      <w:r>
-        <w:t xml:space="preserve">Cas particulier des </w:t>
-      </w:r>
-      <w:proofErr w:type="spellStart"/>
-      <w:r>
-        <w:t>sages-femmes</w:t>
-      </w:r>
-      <w:proofErr w:type="spellEnd"/>
-      <w:r>
-        <w:t> : seule la population des femmes de moins de 50 ans est prise en compte.</w:t>
-      </w:r>
-    </w:p>
-    <w:p>
-      <w:pPr>
-        <w:jc w:val="both"/>
       </w:pPr>
       <w:r>
         <w:t xml:space="preserve">Cas particulier des pédiatres : seule la population de </w:t>
       </w:r>
       <w:r>
-        <w:t>moins de 10 ans est prise en compte.</w:t>
-      </w:r>
-    </w:p>
-    <w:p>
-      <w:pPr>
-        <w:jc w:val="both"/>
-      </w:pPr>
-      <w:r>
-        <w:t>Cas particulier des gériatres : seule la population de plus de 60 ans est prise en compte.</w:t>
+        <w:t>moins de 1</w:t>
+      </w:r>
+      <w:r>
+        <w:t>7</w:t>
+      </w:r>
+      <w:r>
+        <w:t xml:space="preserve"> ans est prise en compte.</w:t>
       </w:r>
     </w:p>
     <w:p/>

</xml_diff>

<commit_message>
30 & 45 min defaults
</commit_message>
<xml_diff>
--- a/apl/doc/apl_cyril.docx
+++ b/apl/doc/apl_cyril.docx
@@ -228,16 +228,11 @@
       <w:r>
         <w:t xml:space="preserve"> situés à une distance inférieure à une valeur de référence (zone de recours). Réciproquement, chaque médecin répond potentiellement à la demande de l’ensemble des habitants situés à une distance inférieure à cette même valeur (zone de patientèle). </w:t>
       </w:r>
-      <w:proofErr w:type="spellStart"/>
       <w:r>
         <w:t>Intègre</w:t>
       </w:r>
       <w:r>
-        <w:t>ateur</w:t>
-      </w:r>
-      <w:proofErr w:type="spellEnd"/>
-      <w:r>
-        <w:t xml:space="preserve"> d’accessibilité potentielle localisée se construit donc en deux temps </w:t>
+        <w:t xml:space="preserve">ateur d’accessibilité potentielle localisée se construit donc en deux temps </w:t>
       </w:r>
       <w:r>
         <w:lastRenderedPageBreak/>
@@ -615,19 +610,11 @@
           <w:lang w:val="en-US"/>
         </w:rPr>
       </w:pPr>
-      <w:proofErr w:type="gramStart"/>
       <w:r>
         <w:rPr>
           <w:lang w:val="en-US"/>
         </w:rPr>
-        <w:t>URL :</w:t>
-      </w:r>
-      <w:proofErr w:type="gramEnd"/>
-      <w:r>
-        <w:rPr>
-          <w:lang w:val="en-US"/>
-        </w:rPr>
-        <w:t xml:space="preserve"> </w:t>
+        <w:t xml:space="preserve">URL : </w:t>
       </w:r>
       <w:hyperlink r:id="rId7" w:history="1">
         <w:r>
@@ -699,19 +686,11 @@
           <w:lang w:val="en-US"/>
         </w:rPr>
       </w:pPr>
-      <w:proofErr w:type="gramStart"/>
       <w:r>
         <w:rPr>
           <w:lang w:val="en-US"/>
         </w:rPr>
-        <w:t>URL :</w:t>
-      </w:r>
-      <w:proofErr w:type="gramEnd"/>
-      <w:r>
-        <w:rPr>
-          <w:lang w:val="en-US"/>
-        </w:rPr>
-        <w:t xml:space="preserve"> </w:t>
+        <w:t xml:space="preserve">URL : </w:t>
       </w:r>
       <w:hyperlink r:id="rId8" w:history="1">
         <w:r>
@@ -758,30 +737,8 @@
         <w:rPr>
           <w:rFonts w:eastAsia="Times New Roman"/>
         </w:rPr>
-        <w:t xml:space="preserve">2.4. </w:t>
-      </w:r>
-      <w:proofErr w:type="spellStart"/>
-      <w:r>
-        <w:rPr>
-          <w:rFonts w:eastAsia="Times New Roman"/>
-        </w:rPr>
-        <w:t>OpenStreetMap</w:t>
-      </w:r>
-      <w:proofErr w:type="spellEnd"/>
-      <w:r>
-        <w:rPr>
-          <w:rFonts w:eastAsia="Times New Roman"/>
-        </w:rPr>
-        <w:t xml:space="preserve"> – </w:t>
-      </w:r>
-      <w:proofErr w:type="spellStart"/>
-      <w:r>
-        <w:rPr>
-          <w:rFonts w:eastAsia="Times New Roman"/>
-        </w:rPr>
-        <w:t>Nominatim</w:t>
-      </w:r>
-      <w:proofErr w:type="spellEnd"/>
+        <w:t>2.4. OpenStreetMap – Nominatim</w:t>
+      </w:r>
     </w:p>
     <w:p>
       <w:pPr>
@@ -796,24 +753,14 @@
           <w14:ligatures w14:val="none"/>
         </w:rPr>
       </w:pPr>
-      <w:proofErr w:type="spellStart"/>
-      <w:r>
-        <w:t>Nominatim</w:t>
-      </w:r>
-      <w:proofErr w:type="spellEnd"/>
-      <w:r>
-        <w:t xml:space="preserve"> </w:t>
+      <w:r>
+        <w:t xml:space="preserve">Nominatim </w:t>
       </w:r>
       <w:r>
         <w:t>d’</w:t>
       </w:r>
-      <w:proofErr w:type="spellStart"/>
-      <w:r>
-        <w:t>OpenStreetMap</w:t>
-      </w:r>
-      <w:proofErr w:type="spellEnd"/>
-      <w:r>
-        <w:t xml:space="preserve"> permet de géocoder des adresses et de récupérer des coordonnées GPS à partir de données cartographiques.</w:t>
+      <w:r>
+        <w:t>OpenStreetMap permet de géocoder des adresses et de récupérer des coordonnées GPS à partir de données cartographiques.</w:t>
       </w:r>
     </w:p>
     <w:p>
@@ -823,19 +770,11 @@
           <w:lang w:val="en-US"/>
         </w:rPr>
       </w:pPr>
-      <w:proofErr w:type="gramStart"/>
       <w:r>
         <w:rPr>
           <w:lang w:val="en-US"/>
         </w:rPr>
-        <w:t>URL :</w:t>
-      </w:r>
-      <w:proofErr w:type="gramEnd"/>
-      <w:r>
-        <w:rPr>
-          <w:lang w:val="en-US"/>
-        </w:rPr>
-        <w:t xml:space="preserve"> </w:t>
+        <w:t xml:space="preserve">URL : </w:t>
       </w:r>
       <w:hyperlink r:id="rId9" w:history="1">
         <w:r>
@@ -882,16 +821,8 @@
         <w:rPr>
           <w:rFonts w:eastAsia="Times New Roman"/>
         </w:rPr>
-        <w:t xml:space="preserve">2.5. Google </w:t>
-      </w:r>
-      <w:proofErr w:type="spellStart"/>
-      <w:r>
-        <w:rPr>
-          <w:rFonts w:eastAsia="Times New Roman"/>
-        </w:rPr>
-        <w:t>Maps</w:t>
-      </w:r>
-      <w:proofErr w:type="spellEnd"/>
+        <w:t>2.5. Google Maps</w:t>
+      </w:r>
     </w:p>
     <w:p>
       <w:pPr>
@@ -917,19 +848,11 @@
           <w:lang w:val="en-US"/>
         </w:rPr>
       </w:pPr>
-      <w:proofErr w:type="gramStart"/>
       <w:r>
         <w:rPr>
           <w:lang w:val="en-US"/>
         </w:rPr>
-        <w:t>URL :</w:t>
-      </w:r>
-      <w:proofErr w:type="gramEnd"/>
-      <w:r>
-        <w:rPr>
-          <w:lang w:val="en-US"/>
-        </w:rPr>
-        <w:t xml:space="preserve"> </w:t>
+        <w:t xml:space="preserve">URL : </w:t>
       </w:r>
       <w:hyperlink r:id="rId10" w:history="1">
         <w:r>
@@ -968,11 +891,9 @@
         <w:pStyle w:val="Titre2"/>
         <w:jc w:val="both"/>
       </w:pPr>
-      <w:proofErr w:type="spellStart"/>
       <w:r>
         <w:t>GraphHopper</w:t>
       </w:r>
-      <w:proofErr w:type="spellEnd"/>
     </w:p>
     <w:p>
       <w:pPr>
@@ -988,15 +909,7 @@
         </w:rPr>
       </w:pPr>
       <w:r>
-        <w:t xml:space="preserve">Fournit toutes les données vectorielles sur les routes et voies d’accès du monde entier, ainsi que les durées de trajet. Planificateur de trajet. Concurrent libre de Google </w:t>
-      </w:r>
-      <w:proofErr w:type="spellStart"/>
-      <w:r>
-        <w:t>Maps</w:t>
-      </w:r>
-      <w:proofErr w:type="spellEnd"/>
-      <w:r>
-        <w:t>.</w:t>
+        <w:t>Fournit toutes les données vectorielles sur les routes et voies d’accès du monde entier, ainsi que les durées de trajet. Planificateur de trajet. Concurrent libre de Google Maps.</w:t>
       </w:r>
     </w:p>
     <w:p>
@@ -1075,19 +988,11 @@
           <w:lang w:val="en-US"/>
         </w:rPr>
       </w:pPr>
-      <w:proofErr w:type="gramStart"/>
       <w:r>
         <w:rPr>
           <w:lang w:val="en-US"/>
         </w:rPr>
-        <w:t>URL :</w:t>
-      </w:r>
-      <w:proofErr w:type="gramEnd"/>
-      <w:r>
-        <w:rPr>
-          <w:lang w:val="en-US"/>
-        </w:rPr>
-        <w:t xml:space="preserve"> </w:t>
+        <w:t xml:space="preserve">URL : </w:t>
       </w:r>
       <w:hyperlink r:id="rId12" w:history="1">
         <w:r>
@@ -1282,13 +1187,8 @@
         <w:jc w:val="both"/>
       </w:pPr>
       <w:r>
-        <w:t xml:space="preserve">INSEE - </w:t>
-      </w:r>
-      <w:proofErr w:type="spellStart"/>
-      <w:r>
-        <w:t>Filosofi</w:t>
-      </w:r>
-      <w:proofErr w:type="spellEnd"/>
+        <w:t>INSEE - Filosofi</w:t>
+      </w:r>
     </w:p>
     <w:p>
       <w:pPr>
@@ -1325,19 +1225,11 @@
           <w:lang w:val="en-US"/>
         </w:rPr>
       </w:pPr>
-      <w:proofErr w:type="gramStart"/>
       <w:r>
         <w:rPr>
           <w:lang w:val="en-US"/>
         </w:rPr>
-        <w:t>URL :</w:t>
-      </w:r>
-      <w:proofErr w:type="gramEnd"/>
-      <w:r>
-        <w:rPr>
-          <w:lang w:val="en-US"/>
-        </w:rPr>
-        <w:t xml:space="preserve"> </w:t>
+        <w:t xml:space="preserve">URL : </w:t>
       </w:r>
       <w:hyperlink r:id="rId15" w:history="1">
         <w:r>
@@ -1403,19 +1295,11 @@
           <w:lang w:val="en-US"/>
         </w:rPr>
       </w:pPr>
-      <w:proofErr w:type="gramStart"/>
       <w:r>
         <w:rPr>
           <w:lang w:val="en-US"/>
         </w:rPr>
-        <w:t>URL :</w:t>
-      </w:r>
-      <w:proofErr w:type="gramEnd"/>
-      <w:r>
-        <w:rPr>
-          <w:lang w:val="en-US"/>
-        </w:rPr>
-        <w:t xml:space="preserve"> </w:t>
+        <w:t xml:space="preserve">URL : </w:t>
       </w:r>
       <w:hyperlink r:id="rId16" w:history="1">
         <w:r>
@@ -1483,19 +1367,11 @@
           <w:lang w:val="en-US"/>
         </w:rPr>
       </w:pPr>
-      <w:proofErr w:type="gramStart"/>
       <w:r>
         <w:rPr>
           <w:lang w:val="en-US"/>
         </w:rPr>
-        <w:t>URL :</w:t>
-      </w:r>
-      <w:proofErr w:type="gramEnd"/>
-      <w:r>
-        <w:rPr>
-          <w:lang w:val="en-US"/>
-        </w:rPr>
-        <w:t xml:space="preserve"> </w:t>
+        <w:t xml:space="preserve">URL : </w:t>
       </w:r>
       <w:hyperlink r:id="rId17" w:history="1">
         <w:r>
@@ -1536,13 +1412,8 @@
       <w:pPr>
         <w:pStyle w:val="Titre2"/>
       </w:pPr>
-      <w:proofErr w:type="spellStart"/>
-      <w:r>
-        <w:t>OpenDataSoft</w:t>
-      </w:r>
-      <w:proofErr w:type="spellEnd"/>
-      <w:r>
-        <w:t xml:space="preserve"> – IRIS</w:t>
+      <w:r>
+        <w:t>OpenDataSoft – IRIS</w:t>
       </w:r>
     </w:p>
     <w:p>
@@ -1568,19 +1439,11 @@
           <w:lang w:val="en-US"/>
         </w:rPr>
       </w:pPr>
-      <w:proofErr w:type="gramStart"/>
       <w:r>
         <w:rPr>
           <w:lang w:val="en-US"/>
         </w:rPr>
-        <w:t>URL :</w:t>
-      </w:r>
-      <w:proofErr w:type="gramEnd"/>
-      <w:r>
-        <w:rPr>
-          <w:lang w:val="en-US"/>
-        </w:rPr>
-        <w:t xml:space="preserve"> </w:t>
+        <w:t xml:space="preserve">URL : </w:t>
       </w:r>
       <w:hyperlink r:id="rId18" w:history="1">
         <w:r>
@@ -1785,19 +1648,11 @@
       <w:r>
         <w:t>ANS est donc filtré par mode d’exercice libéral (</w:t>
       </w:r>
-      <w:proofErr w:type="spellStart"/>
       <w:r>
         <w:rPr>
           <w:rFonts w:ascii="Courier New" w:hAnsi="Courier New" w:cs="Courier New"/>
         </w:rPr>
-        <w:t>code_mode_exercice</w:t>
-      </w:r>
-      <w:proofErr w:type="spellEnd"/>
-      <w:r>
-        <w:rPr>
-          <w:rFonts w:ascii="Courier New" w:hAnsi="Courier New" w:cs="Courier New"/>
-        </w:rPr>
-        <w:t xml:space="preserve"> == ‘L’</w:t>
+        <w:t>code_mode_exercice == ‘L’</w:t>
       </w:r>
       <w:r>
         <w:t>) pour le test de cohérence.</w:t>
@@ -1816,12 +1671,18 @@
     </w:p>
     <w:p>
       <w:r>
-        <w:t>La médiane des différences entre ANS et AMELI est d’environ 1%.</w:t>
-      </w:r>
-    </w:p>
-    <w:p>
-      <w:r>
-        <w:t>Les spécialités dont l’écart est supérieur à 2.5% ne sont pas retenues.</w:t>
+        <w:t>La médiane des différences entre ANS et AMELI est d’environ 1</w:t>
+      </w:r>
+      <w:r>
+        <w:t>.5</w:t>
+      </w:r>
+      <w:r>
+        <w:t>%.</w:t>
+      </w:r>
+    </w:p>
+    <w:p>
+      <w:r>
+        <w:t>Les spécialités dont l’écart est supérieur à 5% ne sont pas retenues.</w:t>
       </w:r>
     </w:p>
     <w:p/>
@@ -2107,7 +1968,10 @@
         </w:numPr>
       </w:pPr>
       <w:r>
-        <w:t>Chirurgien-dentaire</w:t>
+        <w:t>Chirurgien-dent</w:t>
+      </w:r>
+      <w:r>
+        <w:t>istes</w:t>
       </w:r>
     </w:p>
     <w:p>
@@ -2168,11 +2032,9 @@
           <w:numId w:val="22"/>
         </w:numPr>
       </w:pPr>
-      <w:proofErr w:type="spellStart"/>
       <w:r>
         <w:t>Nominatim</w:t>
       </w:r>
-      <w:proofErr w:type="spellEnd"/>
     </w:p>
     <w:p>
       <w:pPr>
@@ -2192,16 +2054,8 @@
         <w:rPr>
           <w:rFonts w:eastAsia="Times New Roman"/>
         </w:rPr>
-        <w:t xml:space="preserve">Google </w:t>
-      </w:r>
-      <w:proofErr w:type="spellStart"/>
-      <w:r>
-        <w:rPr>
-          <w:rFonts w:eastAsia="Times New Roman"/>
-        </w:rPr>
-        <w:t>Maps</w:t>
-      </w:r>
-      <w:proofErr w:type="spellEnd"/>
+        <w:t>Google Maps</w:t>
+      </w:r>
     </w:p>
     <w:p/>
     <w:p>
@@ -2234,15 +2088,7 @@
         </w:rPr>
       </w:pPr>
       <w:r>
-        <w:t xml:space="preserve">Nous mettons en correspondance l’adresse des PS avec la Base Adresse Nationale (BAN). Si l’adresse est normalisée, la correspondance est directe. Dans le cas contraire, nous utilisons un modèle de rapprochement par motifs (pattern </w:t>
-      </w:r>
-      <w:proofErr w:type="spellStart"/>
-      <w:r>
-        <w:t>matching</w:t>
-      </w:r>
-      <w:proofErr w:type="spellEnd"/>
-      <w:r>
-        <w:t>) afin d’identifier l’adresse BAN la plus proche. Les coordonnées GPS sont ensuite récupérées.</w:t>
+        <w:t>Nous mettons en correspondance l’adresse des PS avec la Base Adresse Nationale (BAN). Si l’adresse est normalisée, la correspondance est directe. Dans le cas contraire, nous utilisons un modèle de rapprochement par motifs (pattern matching) afin d’identifier l’adresse BAN la plus proche. Les coordonnées GPS sont ensuite récupérées.</w:t>
       </w:r>
     </w:p>
     <w:p>
@@ -2272,15 +2118,7 @@
       </w:pPr>
       <w:r>
         <w:lastRenderedPageBreak/>
-        <w:t xml:space="preserve">Pour ce rapprochement, nous utilisons l’algorithme Gestalt ainsi qu’un modèle de machine </w:t>
-      </w:r>
-      <w:proofErr w:type="spellStart"/>
-      <w:r>
-        <w:t>learning</w:t>
-      </w:r>
-      <w:proofErr w:type="spellEnd"/>
-      <w:r>
-        <w:t xml:space="preserve"> développé en interne, permettant d’identifier les adresses les plus similaires dans environ 90 % des cas.</w:t>
+        <w:t>Pour ce rapprochement, nous utilisons l’algorithme Gestalt ainsi qu’un modèle de machine learning développé en interne, permettant d’identifier les adresses les plus similaires dans environ 90 % des cas.</w:t>
       </w:r>
     </w:p>
     <w:p/>
@@ -2299,23 +2137,7 @@
         <w:t>la base</w:t>
       </w:r>
       <w:r>
-        <w:t xml:space="preserve"> </w:t>
-      </w:r>
-      <w:proofErr w:type="spellStart"/>
-      <w:r>
-        <w:t>Nominatim</w:t>
-      </w:r>
-      <w:proofErr w:type="spellEnd"/>
-      <w:r>
-        <w:t xml:space="preserve"> d’</w:t>
-      </w:r>
-      <w:proofErr w:type="spellStart"/>
-      <w:r>
-        <w:t>OpenStreetMap</w:t>
-      </w:r>
-      <w:proofErr w:type="spellEnd"/>
-      <w:r>
-        <w:t xml:space="preserve"> est </w:t>
+        <w:t xml:space="preserve"> Nominatim d’OpenStreetMap est </w:t>
       </w:r>
       <w:r>
         <w:t>requêté</w:t>
@@ -2338,15 +2160,7 @@
         </w:rPr>
       </w:pPr>
       <w:r>
-        <w:t xml:space="preserve">Les rares échecs résiduels sont traités manuellement à l’aide de Google </w:t>
-      </w:r>
-      <w:proofErr w:type="spellStart"/>
-      <w:r>
-        <w:t>Maps</w:t>
-      </w:r>
-      <w:proofErr w:type="spellEnd"/>
-      <w:r>
-        <w:t>.</w:t>
+        <w:t>Les rares échecs résiduels sont traités manuellement à l’aide de Google Maps.</w:t>
       </w:r>
     </w:p>
     <w:p/>
@@ -2354,11 +2168,9 @@
       <w:pPr>
         <w:pStyle w:val="Titre2"/>
       </w:pPr>
-      <w:proofErr w:type="spellStart"/>
       <w:r>
         <w:t>GeoIris</w:t>
       </w:r>
-      <w:proofErr w:type="spellEnd"/>
     </w:p>
     <w:p/>
     <w:p>
@@ -2370,42 +2182,13 @@
         </w:rPr>
       </w:pPr>
       <w:r>
-        <w:t xml:space="preserve">Nous avons développé le programme </w:t>
-      </w:r>
-      <w:proofErr w:type="spellStart"/>
-      <w:r>
-        <w:t>GeoIris</w:t>
-      </w:r>
-      <w:proofErr w:type="spellEnd"/>
-      <w:r>
-        <w:t xml:space="preserve">, qui permet, à partir des données « INSEE &amp; IGN – Contours IRIS » et d’une coordonnée GPS, d’identifier l’IRIS correspondant au PS. La marge d’erreur est de 10 mètres. </w:t>
-      </w:r>
-      <w:proofErr w:type="spellStart"/>
-      <w:r>
-        <w:t>GeoIris</w:t>
-      </w:r>
-      <w:proofErr w:type="spellEnd"/>
-      <w:r>
-        <w:t xml:space="preserve"> repose sur des calculs polygonaux implémentés avec </w:t>
-      </w:r>
-      <w:proofErr w:type="spellStart"/>
-      <w:r>
-        <w:t>GeoPandas</w:t>
-      </w:r>
-      <w:proofErr w:type="spellEnd"/>
+        <w:t>Nous avons développé le programme GeoIris, qui permet, à partir des données « INSEE &amp; IGN – Contours IRIS » et d’une coordonnée GPS, d’identifier l’IRIS correspondant au PS. La marge d’erreur est de 10 mètres. GeoIris repose sur des calculs polygonaux implémentés avec GeoPandas</w:t>
+      </w:r>
       <w:r>
         <w:t xml:space="preserve"> </w:t>
       </w:r>
       <w:r>
-        <w:t>(</w:t>
-      </w:r>
-      <w:proofErr w:type="spellStart"/>
-      <w:r>
-        <w:t>GeoDataFrame</w:t>
-      </w:r>
-      <w:proofErr w:type="spellEnd"/>
-      <w:r>
-        <w:t xml:space="preserve">) : </w:t>
+        <w:t xml:space="preserve">(GeoDataFrame) : </w:t>
       </w:r>
       <w:hyperlink r:id="rId20" w:history="1">
         <w:r>
@@ -2441,15 +2224,7 @@
         </w:rPr>
       </w:pPr>
       <w:r>
-        <w:t xml:space="preserve">Les données de cet outil ont été validées et complétées par la base </w:t>
-      </w:r>
-      <w:proofErr w:type="spellStart"/>
-      <w:r>
-        <w:t>OpenDataSoft</w:t>
-      </w:r>
-      <w:proofErr w:type="spellEnd"/>
-      <w:r>
-        <w:t xml:space="preserve"> – IRIS.</w:t>
+        <w:t>Les données de cet outil ont été validées et complétées par la base OpenDataSoft – IRIS.</w:t>
       </w:r>
     </w:p>
     <w:p>
@@ -2481,21 +2256,7 @@
         <w:rPr>
           <w:lang w:val="en-US"/>
         </w:rPr>
-        <w:t xml:space="preserve">La </w:t>
-      </w:r>
-      <w:proofErr w:type="spellStart"/>
-      <w:r>
-        <w:rPr>
-          <w:lang w:val="en-US"/>
-        </w:rPr>
-        <w:t>méthode</w:t>
-      </w:r>
-      <w:proofErr w:type="spellEnd"/>
-      <w:r>
-        <w:rPr>
-          <w:lang w:val="en-US"/>
-        </w:rPr>
-        <w:t xml:space="preserve"> du Two-step floating catchment area (2SFCA)</w:t>
+        <w:t>La méthode du Two-step floating catchment area (2SFCA)</w:t>
       </w:r>
     </w:p>
     <w:p>
@@ -2699,15 +2460,7 @@
         <w:t xml:space="preserve"> de tous les IRIS de France </w:t>
       </w:r>
       <w:r>
-        <w:t xml:space="preserve">par la base </w:t>
-      </w:r>
-      <w:proofErr w:type="spellStart"/>
-      <w:r>
-        <w:t>OpenDatasoft</w:t>
-      </w:r>
-      <w:proofErr w:type="spellEnd"/>
-      <w:r>
-        <w:t xml:space="preserve"> – IRIS.</w:t>
+        <w:t>par la base OpenDatasoft – IRIS.</w:t>
       </w:r>
     </w:p>
     <w:p>
@@ -2840,15 +2593,7 @@
         </w:rPr>
       </w:pPr>
       <w:r>
-        <w:t xml:space="preserve">Environ 17 millions de durées ont été calculées avec Google </w:t>
-      </w:r>
-      <w:proofErr w:type="spellStart"/>
-      <w:r>
-        <w:t>Maps</w:t>
-      </w:r>
-      <w:proofErr w:type="spellEnd"/>
-      <w:r>
-        <w:t xml:space="preserve"> (2024).</w:t>
+        <w:t>Environ 17 millions de durées ont été calculées avec Google Maps (2024).</w:t>
       </w:r>
     </w:p>
     <w:p>
@@ -2860,15 +2605,7 @@
         </w:rPr>
       </w:pPr>
       <w:r>
-        <w:t xml:space="preserve">Environ 788 millions de durées ont été calculées avec </w:t>
-      </w:r>
-      <w:proofErr w:type="spellStart"/>
-      <w:r>
-        <w:t>GraphHopper</w:t>
-      </w:r>
-      <w:proofErr w:type="spellEnd"/>
-      <w:r>
-        <w:t xml:space="preserve"> (2025).</w:t>
+        <w:t>Environ 788 millions de durées ont été calculées avec GraphHopper (2025).</w:t>
       </w:r>
     </w:p>
     <w:p>
@@ -3086,15 +2823,7 @@
         </w:rPr>
       </w:pPr>
       <w:r>
-        <w:t xml:space="preserve">À partir des données de l’ANS, des cabinets sont associés à chaque PS, puis rattachés à un IRIS à l’aide de l’outil </w:t>
-      </w:r>
-      <w:proofErr w:type="spellStart"/>
-      <w:r>
-        <w:t>GeoIris</w:t>
-      </w:r>
-      <w:proofErr w:type="spellEnd"/>
-      <w:r>
-        <w:t>.</w:t>
+        <w:t>À partir des données de l’ANS, des cabinets sont associés à chaque PS, puis rattachés à un IRIS à l’aide de l’outil GeoIris.</w:t>
       </w:r>
     </w:p>
     <w:p/>
@@ -3145,7 +2874,6 @@
     </w:p>
     <w:p/>
     <w:p>
-      <w:proofErr w:type="gramStart"/>
       <w:r>
         <w:rPr>
           <w:rFonts w:ascii="Courier New" w:hAnsi="Courier New" w:cs="Courier New"/>
@@ -3167,14 +2895,12 @@
       <w:r>
         <w:t>:</w:t>
       </w:r>
-      <w:proofErr w:type="gramEnd"/>
       <w:r>
         <w:t xml:space="preserve"> nombre de cabinet</w:t>
       </w:r>
       <w:r>
         <w:t xml:space="preserve"> du </w:t>
       </w:r>
-      <w:proofErr w:type="spellStart"/>
       <w:r>
         <w:rPr>
           <w:rFonts w:ascii="Courier New" w:hAnsi="Courier New" w:cs="Courier New"/>
@@ -3187,7 +2913,6 @@
         </w:rPr>
         <w:t>s</w:t>
       </w:r>
-      <w:proofErr w:type="spellEnd"/>
       <w:r>
         <w:rPr>
           <w:rFonts w:ascii="Courier New" w:hAnsi="Courier New" w:cs="Courier New"/>
@@ -3202,7 +2927,6 @@
       </w:r>
     </w:p>
     <w:p>
-      <w:proofErr w:type="spellStart"/>
       <w:r>
         <w:rPr>
           <w:rFonts w:ascii="Courier New" w:hAnsi="Courier New" w:cs="Courier New"/>
@@ -3215,7 +2939,6 @@
         </w:rPr>
         <w:t>s</w:t>
       </w:r>
-      <w:proofErr w:type="spellEnd"/>
       <w:r>
         <w:t> : l’offre de soins de l’IRIS i</w:t>
       </w:r>
@@ -3248,8 +2971,6 @@
         </w:rPr>
         <w:t>[</w:t>
       </w:r>
-      <w:proofErr w:type="spellStart"/>
-      <w:proofErr w:type="gramStart"/>
       <w:r>
         <w:rPr>
           <w:rFonts w:ascii="Courier New" w:hAnsi="Courier New" w:cs="Courier New"/>
@@ -3257,8 +2978,6 @@
         </w:rPr>
         <w:t>i,s</w:t>
       </w:r>
-      <w:proofErr w:type="spellEnd"/>
-      <w:proofErr w:type="gramEnd"/>
       <w:r>
         <w:rPr>
           <w:rFonts w:ascii="Courier New" w:hAnsi="Courier New" w:cs="Courier New"/>
@@ -3271,49 +2990,22 @@
           <w:rFonts w:ascii="Courier New" w:hAnsi="Courier New" w:cs="Courier New"/>
           <w:lang w:val="en-US"/>
         </w:rPr>
-        <w:t xml:space="preserve"> = </w:t>
-      </w:r>
-      <w:proofErr w:type="spellStart"/>
+        <w:t xml:space="preserve"> = np.sum(</w:t>
+      </w:r>
       <w:r>
         <w:rPr>
           <w:rFonts w:ascii="Courier New" w:hAnsi="Courier New" w:cs="Courier New"/>
           <w:lang w:val="en-US"/>
         </w:rPr>
-        <w:t>np.sum</w:t>
-      </w:r>
-      <w:proofErr w:type="spellEnd"/>
+        <w:t>1/N[i,j</w:t>
+      </w:r>
       <w:r>
         <w:rPr>
           <w:rFonts w:ascii="Courier New" w:hAnsi="Courier New" w:cs="Courier New"/>
           <w:lang w:val="en-US"/>
         </w:rPr>
-        <w:t>(</w:t>
-      </w:r>
-      <w:r>
-        <w:rPr>
-          <w:rFonts w:ascii="Courier New" w:hAnsi="Courier New" w:cs="Courier New"/>
-          <w:lang w:val="en-US"/>
-        </w:rPr>
-        <w:t>1/N[</w:t>
-      </w:r>
-      <w:proofErr w:type="spellStart"/>
-      <w:proofErr w:type="gramStart"/>
-      <w:r>
-        <w:rPr>
-          <w:rFonts w:ascii="Courier New" w:hAnsi="Courier New" w:cs="Courier New"/>
-          <w:lang w:val="en-US"/>
-        </w:rPr>
-        <w:t>i,j</w:t>
-      </w:r>
-      <w:proofErr w:type="gramEnd"/>
-      <w:r>
-        <w:rPr>
-          <w:rFonts w:ascii="Courier New" w:hAnsi="Courier New" w:cs="Courier New"/>
-          <w:lang w:val="en-US"/>
-        </w:rPr>
         <w:t>,s</w:t>
       </w:r>
-      <w:proofErr w:type="spellEnd"/>
       <w:r>
         <w:rPr>
           <w:rFonts w:ascii="Courier New" w:hAnsi="Courier New" w:cs="Courier New"/>
@@ -3500,15 +3192,7 @@
         </w:rPr>
       </w:pPr>
       <w:r>
-        <w:t xml:space="preserve">Les </w:t>
-      </w:r>
-      <w:proofErr w:type="spellStart"/>
-      <w:r>
-        <w:t>Drs</w:t>
-      </w:r>
-      <w:proofErr w:type="spellEnd"/>
-      <w:r>
-        <w:t xml:space="preserve"> Vincent et Doe travaillent dans un seul cabinet.</w:t>
+        <w:t>Les Drs Vincent et Doe travaillent dans un seul cabinet.</w:t>
       </w:r>
     </w:p>
     <w:p>
@@ -5084,28 +4768,12 @@
     </w:p>
     <w:p>
       <w:r>
-        <w:t xml:space="preserve">L’offre de soins de l’IRIS i est </w:t>
-      </w:r>
-      <w:proofErr w:type="spellStart"/>
-      <w:r>
-        <w:t>NBi</w:t>
-      </w:r>
-      <w:proofErr w:type="spellEnd"/>
-      <w:r>
-        <w:t xml:space="preserve"> = 1.83 + 1 + 0.83 = 3.67</w:t>
-      </w:r>
-    </w:p>
-    <w:p>
-      <w:r>
-        <w:t xml:space="preserve">L’offre de soins de l’IRIS j est </w:t>
-      </w:r>
-      <w:proofErr w:type="spellStart"/>
-      <w:r>
-        <w:t>NBj</w:t>
-      </w:r>
-      <w:proofErr w:type="spellEnd"/>
-      <w:r>
-        <w:t xml:space="preserve"> = 0.33</w:t>
+        <w:t>L’offre de soins de l’IRIS i est NBi = 1.83 + 1 + 0.83 = 3.67</w:t>
+      </w:r>
+    </w:p>
+    <w:p>
+      <w:r>
+        <w:t>L’offre de soins de l’IRIS j est NBj = 0.33</w:t>
       </w:r>
     </w:p>
     <w:p/>
@@ -5242,80 +4910,52 @@
       <w:pPr>
         <w:jc w:val="both"/>
       </w:pPr>
-      <w:proofErr w:type="spellStart"/>
       <w:r>
         <w:rPr>
           <w:rFonts w:ascii="Courier New" w:hAnsi="Courier New" w:cs="Courier New"/>
         </w:rPr>
-        <w:t>POPAjustee</w:t>
-      </w:r>
-      <w:proofErr w:type="spellEnd"/>
+        <w:t>POPAjustee[i,s]</w:t>
+      </w:r>
+      <w:r>
+        <w:t> : Population ajustée de l’IRISi pour la spécialité s</w:t>
+      </w:r>
+    </w:p>
+    <w:p>
+      <w:pPr>
+        <w:jc w:val="both"/>
+      </w:pPr>
       <w:r>
         <w:rPr>
           <w:rFonts w:ascii="Courier New" w:hAnsi="Courier New" w:cs="Courier New"/>
         </w:rPr>
-        <w:t>[</w:t>
-      </w:r>
-      <w:proofErr w:type="spellStart"/>
-      <w:proofErr w:type="gramStart"/>
+        <w:t>TRjs</w:t>
+      </w:r>
+      <w:r>
+        <w:t> : Taux de recours moyen pour la tranche d’âge j et la spécialité s</w:t>
+      </w:r>
+    </w:p>
+    <w:p>
+      <w:pPr>
+        <w:jc w:val="both"/>
+      </w:pPr>
       <w:r>
         <w:rPr>
           <w:rFonts w:ascii="Courier New" w:hAnsi="Courier New" w:cs="Courier New"/>
         </w:rPr>
-        <w:t>i,s</w:t>
-      </w:r>
-      <w:proofErr w:type="spellEnd"/>
-      <w:proofErr w:type="gramEnd"/>
+        <w:t>P</w:t>
+      </w:r>
       <w:r>
         <w:rPr>
           <w:rFonts w:ascii="Courier New" w:hAnsi="Courier New" w:cs="Courier New"/>
         </w:rPr>
-        <w:t>]</w:t>
-      </w:r>
-      <w:r>
-        <w:t> : Population ajustée de l’IRISi pour la spécialité s</w:t>
-      </w:r>
-    </w:p>
-    <w:p>
-      <w:pPr>
-        <w:jc w:val="both"/>
-      </w:pPr>
-      <w:proofErr w:type="spellStart"/>
+        <w:t>R</w:t>
+      </w:r>
       <w:r>
         <w:rPr>
           <w:rFonts w:ascii="Courier New" w:hAnsi="Courier New" w:cs="Courier New"/>
         </w:rPr>
-        <w:t>TRjs</w:t>
-      </w:r>
-      <w:proofErr w:type="spellEnd"/>
-      <w:r>
-        <w:t> : Taux de recours moyen pour la tranche d’âge j et la spécialité s</w:t>
-      </w:r>
-    </w:p>
-    <w:p>
-      <w:pPr>
-        <w:jc w:val="both"/>
-      </w:pPr>
-      <w:proofErr w:type="spellStart"/>
-      <w:r>
-        <w:rPr>
-          <w:rFonts w:ascii="Courier New" w:hAnsi="Courier New" w:cs="Courier New"/>
-        </w:rPr>
-        <w:t>P</w:t>
-      </w:r>
-      <w:r>
-        <w:rPr>
-          <w:rFonts w:ascii="Courier New" w:hAnsi="Courier New" w:cs="Courier New"/>
-        </w:rPr>
-        <w:t>R</w:t>
-      </w:r>
-      <w:r>
-        <w:rPr>
-          <w:rFonts w:ascii="Courier New" w:hAnsi="Courier New" w:cs="Courier New"/>
-        </w:rPr>
         <w:t>ijs</w:t>
       </w:r>
-      <w:proofErr w:type="spellEnd"/>
       <w:r>
         <w:t> : Proportion de la tranche d’âge j pour l’IRIS i et la spécialité s</w:t>
       </w:r>
@@ -5344,103 +4984,40 @@
           <w:rFonts w:ascii="Courier New" w:hAnsi="Courier New" w:cs="Courier New"/>
           <w:lang w:val="en-US"/>
         </w:rPr>
-        <w:t>[</w:t>
-      </w:r>
-      <w:proofErr w:type="spellStart"/>
-      <w:proofErr w:type="gramStart"/>
+        <w:t>[i,s] = POP[i] * P</w:t>
+      </w:r>
       <w:r>
         <w:rPr>
           <w:rFonts w:ascii="Courier New" w:hAnsi="Courier New" w:cs="Courier New"/>
           <w:lang w:val="en-US"/>
         </w:rPr>
-        <w:t>i,s</w:t>
-      </w:r>
-      <w:proofErr w:type="spellEnd"/>
-      <w:proofErr w:type="gramEnd"/>
+        <w:t>R</w:t>
+      </w:r>
       <w:r>
         <w:rPr>
           <w:rFonts w:ascii="Courier New" w:hAnsi="Courier New" w:cs="Courier New"/>
           <w:lang w:val="en-US"/>
         </w:rPr>
-        <w:t>] = POP[</w:t>
-      </w:r>
-      <w:proofErr w:type="spellStart"/>
-      <w:r>
-        <w:rPr>
-          <w:rFonts w:ascii="Courier New" w:hAnsi="Courier New" w:cs="Courier New"/>
+        <w:t>[i,j,s] / TR[</w:t>
+      </w:r>
+      <w:r>
+        <w:rPr>
           <w:lang w:val="en-US"/>
         </w:rPr>
-        <w:t>i</w:t>
-      </w:r>
-      <w:proofErr w:type="spellEnd"/>
-      <w:r>
-        <w:rPr>
-          <w:rFonts w:ascii="Courier New" w:hAnsi="Courier New" w:cs="Courier New"/>
+        <w:t>j</w:t>
+      </w:r>
+      <w:r>
+        <w:rPr>
           <w:lang w:val="en-US"/>
         </w:rPr>
-        <w:t>] * P</w:t>
-      </w:r>
-      <w:r>
-        <w:rPr>
-          <w:rFonts w:ascii="Courier New" w:hAnsi="Courier New" w:cs="Courier New"/>
+        <w:t>,</w:t>
+      </w:r>
+      <w:r>
+        <w:rPr>
           <w:lang w:val="en-US"/>
         </w:rPr>
-        <w:t>R</w:t>
-      </w:r>
-      <w:r>
-        <w:rPr>
-          <w:rFonts w:ascii="Courier New" w:hAnsi="Courier New" w:cs="Courier New"/>
-          <w:lang w:val="en-US"/>
-        </w:rPr>
-        <w:t>[</w:t>
-      </w:r>
-      <w:proofErr w:type="spellStart"/>
-      <w:proofErr w:type="gramStart"/>
-      <w:r>
-        <w:rPr>
-          <w:rFonts w:ascii="Courier New" w:hAnsi="Courier New" w:cs="Courier New"/>
-          <w:lang w:val="en-US"/>
-        </w:rPr>
-        <w:t>i,j</w:t>
-      </w:r>
-      <w:proofErr w:type="gramEnd"/>
-      <w:r>
-        <w:rPr>
-          <w:rFonts w:ascii="Courier New" w:hAnsi="Courier New" w:cs="Courier New"/>
-          <w:lang w:val="en-US"/>
-        </w:rPr>
-        <w:t>,s</w:t>
-      </w:r>
-      <w:proofErr w:type="spellEnd"/>
-      <w:r>
-        <w:rPr>
-          <w:rFonts w:ascii="Courier New" w:hAnsi="Courier New" w:cs="Courier New"/>
-          <w:lang w:val="en-US"/>
-        </w:rPr>
-        <w:t>] / TR[</w:t>
-      </w:r>
-      <w:proofErr w:type="spellStart"/>
-      <w:proofErr w:type="gramStart"/>
-      <w:r>
-        <w:rPr>
-          <w:lang w:val="en-US"/>
-        </w:rPr>
-        <w:t>j</w:t>
-      </w:r>
-      <w:r>
-        <w:rPr>
-          <w:lang w:val="en-US"/>
-        </w:rPr>
-        <w:t>,</w:t>
-      </w:r>
-      <w:r>
-        <w:rPr>
-          <w:lang w:val="en-US"/>
-        </w:rPr>
         <w:t>s</w:t>
       </w:r>
-      <w:proofErr w:type="spellEnd"/>
-      <w:proofErr w:type="gramEnd"/>
       <w:r>
         <w:rPr>
           <w:lang w:val="en-US"/>
@@ -5605,7 +5182,19 @@
         <w:rPr>
           <w:rFonts w:eastAsia="Times New Roman"/>
         </w:rPr>
-        <w:t xml:space="preserve"> des données de la classe d’âge 0-20 ans (DAMIR) ont été affectées à la classe d’âge 0-2 ans (INSEE), sauf pour les pédiatres et les généralistes : 6/20</w:t>
+        <w:t xml:space="preserve"> des données de la classe d’âge 0-20 ans (DAMIR) ont été affectées à la classe d’âge 0-2 ans (INSEE), sauf pour les pédiatres</w:t>
+      </w:r>
+      <w:r>
+        <w:rPr>
+          <w:rFonts w:eastAsia="Times New Roman"/>
+        </w:rPr>
+        <w:t xml:space="preserve"> </w:t>
+      </w:r>
+      <w:r>
+        <w:rPr>
+          <w:rFonts w:eastAsia="Times New Roman"/>
+        </w:rPr>
+        <w:t>: 6/20</w:t>
       </w:r>
       <w:r>
         <w:rPr>
@@ -5682,7 +5271,7 @@
         <w:rPr>
           <w:rFonts w:eastAsia="Times New Roman"/>
         </w:rPr>
-        <w:t xml:space="preserve"> affectées à la classe d’âge 6-10, sauf pour les pédiatres et les généralistes : 4/20</w:t>
+        <w:t xml:space="preserve"> affectées à la classe d’âge 6-10, sauf pour les pédiatres : 4/20</w:t>
       </w:r>
       <w:r>
         <w:rPr>
@@ -5724,7 +5313,7 @@
         <w:rPr>
           <w:rFonts w:eastAsia="Times New Roman"/>
         </w:rPr>
-        <w:t xml:space="preserve"> affectées à la classe d’âge 11-17, sauf pour les pédiatres et les généralistes : 5/20</w:t>
+        <w:t xml:space="preserve"> affectées à la classe d’âge 11-17, sauf pour les pédiatres : 5/20</w:t>
       </w:r>
       <w:r>
         <w:rPr>
@@ -5766,7 +5355,7 @@
         <w:rPr>
           <w:rFonts w:eastAsia="Times New Roman"/>
         </w:rPr>
-        <w:t xml:space="preserve"> affectées à la classe d’âge 18-24, sauf pour les pédiatres et les généralistes : 1/20</w:t>
+        <w:t xml:space="preserve"> affectées à la classe d’âge 18-24, sauf pour les pédiatres : 1/20</w:t>
       </w:r>
       <w:r>
         <w:rPr>
@@ -5908,174 +5497,82 @@
         <w:rPr>
           <w:rFonts w:ascii="Courier New" w:hAnsi="Courier New" w:cs="Courier New"/>
         </w:rPr>
-        <w:t>w(</w:t>
-      </w:r>
-      <w:proofErr w:type="spellStart"/>
+        <w:t>w(dij)</w:t>
+      </w:r>
+      <w:r>
+        <w:t xml:space="preserve"> qui pondère la distance entre les IRIS i et j</w:t>
+      </w:r>
+      <w:r>
+        <w:t xml:space="preserve"> influence fortement la valeur de l’indicateur d’accessibilité potentielle localisée. Les résultats présentés dans cette étude utilisent une pondération s’appuyant </w:t>
+      </w:r>
+      <w:r>
+        <w:t>sur une fonction exponentielle continue :</w:t>
+      </w:r>
+    </w:p>
+    <w:p/>
+    <w:p>
       <w:r>
         <w:rPr>
           <w:rFonts w:ascii="Courier New" w:hAnsi="Courier New" w:cs="Courier New"/>
         </w:rPr>
-        <w:t>dij</w:t>
-      </w:r>
-      <w:proofErr w:type="spellEnd"/>
+        <w:t>w</w:t>
+      </w:r>
       <w:r>
         <w:rPr>
           <w:rFonts w:ascii="Courier New" w:hAnsi="Courier New" w:cs="Courier New"/>
         </w:rPr>
+        <w:t>(d</w:t>
+      </w:r>
+      <w:r>
+        <w:rPr>
+          <w:rFonts w:ascii="Courier New" w:hAnsi="Courier New" w:cs="Courier New"/>
+        </w:rPr>
+        <w:t>[i,j]</w:t>
+      </w:r>
+      <w:r>
+        <w:rPr>
+          <w:rFonts w:ascii="Courier New" w:hAnsi="Courier New" w:cs="Courier New"/>
+        </w:rPr>
+        <w:t>) = np.exp(a * d</w:t>
+      </w:r>
+      <w:r>
+        <w:rPr>
+          <w:rFonts w:ascii="Courier New" w:hAnsi="Courier New" w:cs="Courier New"/>
+        </w:rPr>
+        <w:t>[i,j]</w:t>
+      </w:r>
+      <w:r>
+        <w:rPr>
+          <w:rFonts w:ascii="Courier New" w:hAnsi="Courier New" w:cs="Courier New"/>
+        </w:rPr>
         <w:t>)</w:t>
       </w:r>
       <w:r>
-        <w:t xml:space="preserve"> qui pondère la distance entre les IRIS i et j</w:t>
-      </w:r>
-      <w:r>
-        <w:t xml:space="preserve"> influence fortement la valeur de l’indicateur d’accessibilité potentielle localisée. Les résultats présentés dans cette étude utilisent une pondération s’appuyant </w:t>
-      </w:r>
-      <w:r>
-        <w:t>sur une fonction exponentielle continue :</w:t>
-      </w:r>
-    </w:p>
-    <w:p/>
-    <w:p>
-      <w:proofErr w:type="gramStart"/>
-      <w:r>
         <w:rPr>
           <w:rFonts w:ascii="Courier New" w:hAnsi="Courier New" w:cs="Courier New"/>
         </w:rPr>
-        <w:t>w</w:t>
-      </w:r>
-      <w:proofErr w:type="gramEnd"/>
+        <w:t xml:space="preserve"> if d &lt; </w:t>
+      </w:r>
       <w:r>
         <w:rPr>
           <w:rFonts w:ascii="Courier New" w:hAnsi="Courier New" w:cs="Courier New"/>
         </w:rPr>
-        <w:t>(d</w:t>
+        <w:t>d0</w:t>
       </w:r>
       <w:r>
         <w:rPr>
           <w:rFonts w:ascii="Courier New" w:hAnsi="Courier New" w:cs="Courier New"/>
         </w:rPr>
-        <w:t>[</w:t>
-      </w:r>
-      <w:proofErr w:type="spellStart"/>
-      <w:proofErr w:type="gramStart"/>
+        <w:t xml:space="preserve"> else 0</w:t>
+      </w:r>
       <w:r>
         <w:rPr>
           <w:rFonts w:ascii="Courier New" w:hAnsi="Courier New" w:cs="Courier New"/>
         </w:rPr>
-        <w:t>i,j</w:t>
-      </w:r>
-      <w:proofErr w:type="spellEnd"/>
-      <w:proofErr w:type="gramEnd"/>
-      <w:r>
-        <w:rPr>
-          <w:rFonts w:ascii="Courier New" w:hAnsi="Courier New" w:cs="Courier New"/>
-        </w:rPr>
-        <w:t>]</w:t>
-      </w:r>
-      <w:r>
-        <w:rPr>
-          <w:rFonts w:ascii="Courier New" w:hAnsi="Courier New" w:cs="Courier New"/>
-        </w:rPr>
-        <w:t xml:space="preserve">) = </w:t>
-      </w:r>
-      <w:proofErr w:type="spellStart"/>
-      <w:proofErr w:type="gramStart"/>
-      <w:r>
-        <w:rPr>
-          <w:rFonts w:ascii="Courier New" w:hAnsi="Courier New" w:cs="Courier New"/>
-        </w:rPr>
-        <w:t>np.exp</w:t>
-      </w:r>
-      <w:proofErr w:type="spellEnd"/>
-      <w:r>
-        <w:rPr>
-          <w:rFonts w:ascii="Courier New" w:hAnsi="Courier New" w:cs="Courier New"/>
-        </w:rPr>
-        <w:t>(</w:t>
-      </w:r>
-      <w:proofErr w:type="gramEnd"/>
-      <w:r>
-        <w:rPr>
-          <w:rFonts w:ascii="Courier New" w:hAnsi="Courier New" w:cs="Courier New"/>
-        </w:rPr>
-        <w:t>a * d</w:t>
-      </w:r>
-      <w:r>
-        <w:rPr>
-          <w:rFonts w:ascii="Courier New" w:hAnsi="Courier New" w:cs="Courier New"/>
-        </w:rPr>
-        <w:t>[</w:t>
-      </w:r>
-      <w:proofErr w:type="spellStart"/>
-      <w:proofErr w:type="gramStart"/>
-      <w:r>
-        <w:rPr>
-          <w:rFonts w:ascii="Courier New" w:hAnsi="Courier New" w:cs="Courier New"/>
-        </w:rPr>
-        <w:t>i,j</w:t>
-      </w:r>
-      <w:proofErr w:type="spellEnd"/>
-      <w:proofErr w:type="gramEnd"/>
-      <w:r>
-        <w:rPr>
-          <w:rFonts w:ascii="Courier New" w:hAnsi="Courier New" w:cs="Courier New"/>
-        </w:rPr>
-        <w:t>]</w:t>
-      </w:r>
-      <w:r>
-        <w:rPr>
-          <w:rFonts w:ascii="Courier New" w:hAnsi="Courier New" w:cs="Courier New"/>
-        </w:rPr>
-        <w:t>)</w:t>
-      </w:r>
-      <w:r>
-        <w:rPr>
-          <w:rFonts w:ascii="Courier New" w:hAnsi="Courier New" w:cs="Courier New"/>
-        </w:rPr>
-        <w:t xml:space="preserve"> if d &lt; </w:t>
-      </w:r>
-      <w:r>
-        <w:rPr>
-          <w:rFonts w:ascii="Courier New" w:hAnsi="Courier New" w:cs="Courier New"/>
-        </w:rPr>
-        <w:t>d0</w:t>
-      </w:r>
-      <w:r>
-        <w:rPr>
-          <w:rFonts w:ascii="Courier New" w:hAnsi="Courier New" w:cs="Courier New"/>
-        </w:rPr>
         <w:t xml:space="preserve"> </w:t>
       </w:r>
-      <w:proofErr w:type="spellStart"/>
-      <w:r>
-        <w:rPr>
-          <w:rFonts w:ascii="Courier New" w:hAnsi="Courier New" w:cs="Courier New"/>
-        </w:rPr>
-        <w:t>else</w:t>
-      </w:r>
-      <w:proofErr w:type="spellEnd"/>
-      <w:r>
-        <w:rPr>
-          <w:rFonts w:ascii="Courier New" w:hAnsi="Courier New" w:cs="Courier New"/>
-        </w:rPr>
-        <w:t xml:space="preserve"> 0</w:t>
-      </w:r>
-      <w:r>
-        <w:rPr>
-          <w:rFonts w:ascii="Courier New" w:hAnsi="Courier New" w:cs="Courier New"/>
-        </w:rPr>
-        <w:t xml:space="preserve"> </w:t>
-      </w:r>
-      <w:r>
-        <w:t xml:space="preserve">où fa est la fonction d’accessibilité, a une constante négative et </w:t>
-      </w:r>
-      <w:proofErr w:type="spellStart"/>
-      <w:r>
-        <w:t>d une</w:t>
-      </w:r>
-      <w:proofErr w:type="spellEnd"/>
-      <w:r>
-        <w:t xml:space="preserve"> durée de trajet.</w:t>
+      <w:r>
+        <w:t>où fa est la fonction d’accessibilité, a une constante négative et d une durée de trajet.</w:t>
       </w:r>
     </w:p>
     <w:p/>
@@ -6501,14 +5998,11 @@
       </w:pPr>
     </w:p>
     <w:p>
-      <w:pPr>
-        <w:rPr>
-          <w:kern w:val="0"/>
-          <w14:ligatures w14:val="none"/>
-        </w:rPr>
-      </w:pPr>
-      <w:r>
-        <w:t>Les valeurs par défaut recommandées sont d0 = 30 minutes et a = -0.12.</w:t>
+      <w:r>
+        <w:t>Les valeurs par défaut recommandées sont d0 = 30 minutes et a = -0.12</w:t>
+      </w:r>
+      <w:r>
+        <w:t xml:space="preserve"> pour les généralistes, infirmiers et les chirurgiens-dentistes, d0 = 45 minutes et a = -0.08 pour les autres.</w:t>
       </w:r>
     </w:p>
     <w:p>
@@ -6583,16 +6077,11 @@
         <w:t>durée de trajet</w:t>
       </w:r>
       <w:r>
-        <w:t xml:space="preserve"> est inférieure à un seuil de référence d0. On calcule ainsi un ratio </w:t>
-      </w:r>
-      <w:proofErr w:type="spellStart"/>
-      <w:r>
-        <w:t>Rj</w:t>
+        <w:t xml:space="preserve"> est inférieure à un seuil de référence d0. On calcule ainsi un ratio Rj</w:t>
       </w:r>
       <w:r>
         <w:t>s</w:t>
       </w:r>
-      <w:proofErr w:type="spellEnd"/>
       <w:r>
         <w:t xml:space="preserve"> qui rapporte l’offre de </w:t>
       </w:r>
@@ -6656,141 +6145,35 @@
           <w:rFonts w:ascii="Courier New" w:hAnsi="Courier New" w:cs="Courier New"/>
           <w:lang w:val="en-US"/>
         </w:rPr>
-        <w:t>R[</w:t>
-      </w:r>
-      <w:proofErr w:type="spellStart"/>
-      <w:proofErr w:type="gramStart"/>
+        <w:t>R[j,s] = NB[j,s] / (np.sum(P[i,s][D[i,j] &lt;</w:t>
+      </w:r>
       <w:r>
         <w:rPr>
           <w:rFonts w:ascii="Courier New" w:hAnsi="Courier New" w:cs="Courier New"/>
           <w:lang w:val="en-US"/>
         </w:rPr>
-        <w:t>j,s</w:t>
-      </w:r>
-      <w:proofErr w:type="spellEnd"/>
-      <w:proofErr w:type="gramEnd"/>
+        <w:t>=</w:t>
+      </w:r>
       <w:r>
         <w:rPr>
           <w:rFonts w:ascii="Courier New" w:hAnsi="Courier New" w:cs="Courier New"/>
           <w:lang w:val="en-US"/>
         </w:rPr>
-        <w:t>] = NB[</w:t>
-      </w:r>
-      <w:proofErr w:type="spellStart"/>
-      <w:proofErr w:type="gramStart"/>
+        <w:t xml:space="preserve"> d0] * </w:t>
+      </w:r>
       <w:r>
         <w:rPr>
           <w:rFonts w:ascii="Courier New" w:hAnsi="Courier New" w:cs="Courier New"/>
           <w:lang w:val="en-US"/>
         </w:rPr>
-        <w:t>j,s</w:t>
-      </w:r>
-      <w:proofErr w:type="spellEnd"/>
-      <w:proofErr w:type="gramEnd"/>
+        <w:t>w</w:t>
+      </w:r>
       <w:r>
         <w:rPr>
           <w:rFonts w:ascii="Courier New" w:hAnsi="Courier New" w:cs="Courier New"/>
           <w:lang w:val="en-US"/>
         </w:rPr>
-        <w:t>] / (</w:t>
-      </w:r>
-      <w:proofErr w:type="spellStart"/>
-      <w:r>
-        <w:rPr>
-          <w:rFonts w:ascii="Courier New" w:hAnsi="Courier New" w:cs="Courier New"/>
-          <w:lang w:val="en-US"/>
-        </w:rPr>
-        <w:t>np.sum</w:t>
-      </w:r>
-      <w:proofErr w:type="spellEnd"/>
-      <w:r>
-        <w:rPr>
-          <w:rFonts w:ascii="Courier New" w:hAnsi="Courier New" w:cs="Courier New"/>
-          <w:lang w:val="en-US"/>
-        </w:rPr>
-        <w:t>(P[</w:t>
-      </w:r>
-      <w:proofErr w:type="spellStart"/>
-      <w:proofErr w:type="gramStart"/>
-      <w:r>
-        <w:rPr>
-          <w:rFonts w:ascii="Courier New" w:hAnsi="Courier New" w:cs="Courier New"/>
-          <w:lang w:val="en-US"/>
-        </w:rPr>
-        <w:t>i,s</w:t>
-      </w:r>
-      <w:proofErr w:type="spellEnd"/>
-      <w:proofErr w:type="gramEnd"/>
-      <w:r>
-        <w:rPr>
-          <w:rFonts w:ascii="Courier New" w:hAnsi="Courier New" w:cs="Courier New"/>
-          <w:lang w:val="en-US"/>
-        </w:rPr>
-        <w:t>][D[</w:t>
-      </w:r>
-      <w:proofErr w:type="spellStart"/>
-      <w:proofErr w:type="gramStart"/>
-      <w:r>
-        <w:rPr>
-          <w:rFonts w:ascii="Courier New" w:hAnsi="Courier New" w:cs="Courier New"/>
-          <w:lang w:val="en-US"/>
-        </w:rPr>
-        <w:t>i,j</w:t>
-      </w:r>
-      <w:proofErr w:type="spellEnd"/>
-      <w:proofErr w:type="gramEnd"/>
-      <w:r>
-        <w:rPr>
-          <w:rFonts w:ascii="Courier New" w:hAnsi="Courier New" w:cs="Courier New"/>
-          <w:lang w:val="en-US"/>
-        </w:rPr>
-        <w:t>] &lt;</w:t>
-      </w:r>
-      <w:r>
-        <w:rPr>
-          <w:rFonts w:ascii="Courier New" w:hAnsi="Courier New" w:cs="Courier New"/>
-          <w:lang w:val="en-US"/>
-        </w:rPr>
-        <w:t>=</w:t>
-      </w:r>
-      <w:r>
-        <w:rPr>
-          <w:rFonts w:ascii="Courier New" w:hAnsi="Courier New" w:cs="Courier New"/>
-          <w:lang w:val="en-US"/>
-        </w:rPr>
-        <w:t xml:space="preserve"> d0] * </w:t>
-      </w:r>
-      <w:r>
-        <w:rPr>
-          <w:rFonts w:ascii="Courier New" w:hAnsi="Courier New" w:cs="Courier New"/>
-          <w:lang w:val="en-US"/>
-        </w:rPr>
-        <w:t>w</w:t>
-      </w:r>
-      <w:r>
-        <w:rPr>
-          <w:rFonts w:ascii="Courier New" w:hAnsi="Courier New" w:cs="Courier New"/>
-          <w:lang w:val="en-US"/>
-        </w:rPr>
-        <w:t>(D[</w:t>
-      </w:r>
-      <w:proofErr w:type="spellStart"/>
-      <w:proofErr w:type="gramStart"/>
-      <w:r>
-        <w:rPr>
-          <w:rFonts w:ascii="Courier New" w:hAnsi="Courier New" w:cs="Courier New"/>
-          <w:lang w:val="en-US"/>
-        </w:rPr>
-        <w:t>i,j</w:t>
-      </w:r>
-      <w:proofErr w:type="spellEnd"/>
-      <w:proofErr w:type="gramEnd"/>
-      <w:r>
-        <w:rPr>
-          <w:rFonts w:ascii="Courier New" w:hAnsi="Courier New" w:cs="Courier New"/>
-          <w:lang w:val="en-US"/>
-        </w:rPr>
-        <w:t>])</w:t>
+        <w:t>(D[i,j])</w:t>
       </w:r>
     </w:p>
     <w:p>
@@ -6922,14 +6305,13 @@
     </w:p>
     <w:p/>
     <w:p>
-      <w:proofErr w:type="spellStart"/>
       <w:r>
         <w:rPr>
           <w:rFonts w:ascii="Courier New" w:hAnsi="Courier New" w:cs="Courier New"/>
         </w:rPr>
+        <w:lastRenderedPageBreak/>
         <w:t>NBjs</w:t>
       </w:r>
-      <w:proofErr w:type="spellEnd"/>
       <w:r>
         <w:t xml:space="preserve"> mesure l’offre de soins dans l’IRIS j et la spécialité s</w:t>
       </w:r>
@@ -6942,7 +6324,6 @@
         <w:rPr>
           <w:rFonts w:ascii="Courier New" w:hAnsi="Courier New" w:cs="Courier New"/>
         </w:rPr>
-        <w:lastRenderedPageBreak/>
         <w:t>Pis</w:t>
       </w:r>
       <w:r>
@@ -6950,46 +6331,28 @@
       </w:r>
     </w:p>
     <w:p>
-      <w:proofErr w:type="spellStart"/>
       <w:r>
         <w:rPr>
           <w:rFonts w:ascii="Courier New" w:hAnsi="Courier New" w:cs="Courier New"/>
         </w:rPr>
         <w:t>Dij</w:t>
       </w:r>
-      <w:proofErr w:type="spellEnd"/>
       <w:r>
         <w:t xml:space="preserve"> mesure la distance entre les IRIS i et j.</w:t>
       </w:r>
     </w:p>
     <w:p>
-      <w:proofErr w:type="gramStart"/>
       <w:r>
         <w:rPr>
           <w:rFonts w:ascii="Courier New" w:hAnsi="Courier New" w:cs="Courier New"/>
         </w:rPr>
         <w:t>w</w:t>
       </w:r>
-      <w:proofErr w:type="gramEnd"/>
       <w:r>
         <w:rPr>
           <w:rFonts w:ascii="Courier New" w:hAnsi="Courier New" w:cs="Courier New"/>
         </w:rPr>
-        <w:t>(</w:t>
-      </w:r>
-      <w:proofErr w:type="spellStart"/>
-      <w:r>
-        <w:rPr>
-          <w:rFonts w:ascii="Courier New" w:hAnsi="Courier New" w:cs="Courier New"/>
-        </w:rPr>
-        <w:t>Dij</w:t>
-      </w:r>
-      <w:proofErr w:type="spellEnd"/>
-      <w:r>
-        <w:rPr>
-          <w:rFonts w:ascii="Courier New" w:hAnsi="Courier New" w:cs="Courier New"/>
-        </w:rPr>
-        <w:t>)</w:t>
+        <w:t>(Dij)</w:t>
       </w:r>
       <w:r>
         <w:t xml:space="preserve"> est la pondération relative à la distance.</w:t>
@@ -7063,75 +6426,7 @@
           <w:rFonts w:ascii="Courier New" w:hAnsi="Courier New" w:cs="Courier New"/>
           <w:lang w:val="en-US"/>
         </w:rPr>
-        <w:t>APL[</w:t>
-      </w:r>
-      <w:proofErr w:type="spellStart"/>
-      <w:proofErr w:type="gramStart"/>
-      <w:r>
-        <w:rPr>
-          <w:rFonts w:ascii="Courier New" w:hAnsi="Courier New" w:cs="Courier New"/>
-          <w:lang w:val="en-US"/>
-        </w:rPr>
-        <w:t>i,s</w:t>
-      </w:r>
-      <w:proofErr w:type="spellEnd"/>
-      <w:proofErr w:type="gramEnd"/>
-      <w:r>
-        <w:rPr>
-          <w:rFonts w:ascii="Courier New" w:hAnsi="Courier New" w:cs="Courier New"/>
-          <w:lang w:val="en-US"/>
-        </w:rPr>
-        <w:t xml:space="preserve">] = </w:t>
-      </w:r>
-      <w:proofErr w:type="spellStart"/>
-      <w:proofErr w:type="gramStart"/>
-      <w:r>
-        <w:rPr>
-          <w:rFonts w:ascii="Courier New" w:hAnsi="Courier New" w:cs="Courier New"/>
-          <w:lang w:val="en-US"/>
-        </w:rPr>
-        <w:t>np.sum</w:t>
-      </w:r>
-      <w:proofErr w:type="spellEnd"/>
-      <w:r>
-        <w:rPr>
-          <w:rFonts w:ascii="Courier New" w:hAnsi="Courier New" w:cs="Courier New"/>
-          <w:lang w:val="en-US"/>
-        </w:rPr>
-        <w:t>(</w:t>
-      </w:r>
-      <w:proofErr w:type="spellStart"/>
-      <w:r>
-        <w:rPr>
-          <w:rFonts w:ascii="Courier New" w:hAnsi="Courier New" w:cs="Courier New"/>
-          <w:lang w:val="en-US"/>
-        </w:rPr>
-        <w:t>Rjs</w:t>
-      </w:r>
-      <w:proofErr w:type="spellEnd"/>
-      <w:r>
-        <w:rPr>
-          <w:rFonts w:ascii="Courier New" w:hAnsi="Courier New" w:cs="Courier New"/>
-          <w:lang w:val="en-US"/>
-        </w:rPr>
-        <w:t>[</w:t>
-      </w:r>
-      <w:proofErr w:type="spellStart"/>
-      <w:proofErr w:type="gramEnd"/>
-      <w:r>
-        <w:rPr>
-          <w:rFonts w:ascii="Courier New" w:hAnsi="Courier New" w:cs="Courier New"/>
-          <w:lang w:val="en-US"/>
-        </w:rPr>
-        <w:t>Dij</w:t>
-      </w:r>
-      <w:proofErr w:type="spellEnd"/>
-      <w:r>
-        <w:rPr>
-          <w:rFonts w:ascii="Courier New" w:hAnsi="Courier New" w:cs="Courier New"/>
-          <w:lang w:val="en-US"/>
-        </w:rPr>
-        <w:t xml:space="preserve"> &lt;</w:t>
+        <w:t>APL[i,s] = np.sum(Rjs[Dij &lt;</w:t>
       </w:r>
       <w:r>
         <w:rPr>
@@ -7229,14 +6524,12 @@
           <w:lang w:val="en-US"/>
         </w:rPr>
       </w:pPr>
-      <w:proofErr w:type="spellStart"/>
       <w:r>
         <w:rPr>
           <w:lang w:val="en-US"/>
         </w:rPr>
         <w:t>GeoDataViz</w:t>
       </w:r>
-      <w:proofErr w:type="spellEnd"/>
     </w:p>
     <w:p>
       <w:pPr>
@@ -7454,15 +6747,7 @@
       </w:pPr>
       <w:r>
         <w:lastRenderedPageBreak/>
-        <w:t xml:space="preserve">Les données de la base </w:t>
-      </w:r>
-      <w:proofErr w:type="spellStart"/>
-      <w:r>
-        <w:t>Filosofi</w:t>
-      </w:r>
-      <w:proofErr w:type="spellEnd"/>
-      <w:r>
-        <w:t xml:space="preserve"> sont ensuite intégrées.</w:t>
+        <w:t>Les données de la base Filosofi sont ensuite intégrées.</w:t>
       </w:r>
     </w:p>
     <w:p>
@@ -7482,15 +6767,7 @@
         </w:rPr>
       </w:pPr>
       <w:r>
-        <w:t xml:space="preserve">Détail d’un IRIS pour les généralistes sur la commune de Nice en 2025, pour D0 = 30 minutes et a = -0.12, complété par les données </w:t>
-      </w:r>
-      <w:proofErr w:type="spellStart"/>
-      <w:r>
-        <w:t>Filosofi</w:t>
-      </w:r>
-      <w:proofErr w:type="spellEnd"/>
-      <w:r>
-        <w:t>.</w:t>
+        <w:t>Détail d’un IRIS pour les généralistes sur la commune de Nice en 2025, pour D0 = 30 minutes et a = -0.12, complété par les données Filosofi.</w:t>
       </w:r>
     </w:p>
     <w:p/>
@@ -7675,27 +6952,11 @@
         </w:rPr>
         <w:t xml:space="preserve">Constante de la fonction de décroissance : il s’agit de la constante a de la fonction </w:t>
       </w:r>
-      <w:proofErr w:type="spellStart"/>
-      <w:proofErr w:type="gramStart"/>
       <w:r>
         <w:rPr>
           <w:rFonts w:eastAsia="Times New Roman"/>
         </w:rPr>
-        <w:t>exp</w:t>
-      </w:r>
-      <w:proofErr w:type="spellEnd"/>
-      <w:r>
-        <w:rPr>
-          <w:rFonts w:eastAsia="Times New Roman"/>
-        </w:rPr>
-        <w:t>(</w:t>
-      </w:r>
-      <w:proofErr w:type="gramEnd"/>
-      <w:r>
-        <w:rPr>
-          <w:rFonts w:eastAsia="Times New Roman"/>
-        </w:rPr>
-        <w:t>a * x)</w:t>
+        <w:t>exp(a * x)</w:t>
       </w:r>
       <w:r>
         <w:rPr>
@@ -8052,31 +7313,7 @@
         </w:rPr>
       </w:pPr>
       <w:r>
-        <w:t xml:space="preserve">Les calculs sont effectués en Python, avec les bibliothèques Pandas, </w:t>
-      </w:r>
-      <w:proofErr w:type="spellStart"/>
-      <w:r>
-        <w:t>GeoPandas</w:t>
-      </w:r>
-      <w:proofErr w:type="spellEnd"/>
-      <w:r>
-        <w:t xml:space="preserve">, </w:t>
-      </w:r>
-      <w:proofErr w:type="spellStart"/>
-      <w:r>
-        <w:t>NumPy</w:t>
-      </w:r>
-      <w:proofErr w:type="spellEnd"/>
-      <w:r>
-        <w:t xml:space="preserve"> et </w:t>
-      </w:r>
-      <w:proofErr w:type="spellStart"/>
-      <w:r>
-        <w:t>scikit-learn</w:t>
-      </w:r>
-      <w:proofErr w:type="spellEnd"/>
-      <w:r>
-        <w:t>.</w:t>
+        <w:t>Les calculs sont effectués en Python, avec les bibliothèques Pandas, GeoPandas, NumPy et scikit-learn.</w:t>
       </w:r>
     </w:p>
     <w:p>
@@ -8101,55 +7338,7 @@
       </w:pPr>
       <w:r>
         <w:lastRenderedPageBreak/>
-        <w:t>Le module de visualisation (</w:t>
-      </w:r>
-      <w:proofErr w:type="spellStart"/>
-      <w:r>
-        <w:t>DataViz</w:t>
-      </w:r>
-      <w:proofErr w:type="spellEnd"/>
-      <w:r>
-        <w:t xml:space="preserve">) est développé en </w:t>
-      </w:r>
-      <w:proofErr w:type="spellStart"/>
-      <w:r>
-        <w:t>ECMAScript</w:t>
-      </w:r>
-      <w:proofErr w:type="spellEnd"/>
-      <w:r>
-        <w:t xml:space="preserve">, avec les </w:t>
-      </w:r>
-      <w:proofErr w:type="spellStart"/>
-      <w:r>
-        <w:t>frameworks</w:t>
-      </w:r>
-      <w:proofErr w:type="spellEnd"/>
-      <w:r>
-        <w:t xml:space="preserve"> </w:t>
-      </w:r>
-      <w:proofErr w:type="spellStart"/>
-      <w:r>
-        <w:t>Angular</w:t>
-      </w:r>
-      <w:proofErr w:type="spellEnd"/>
-      <w:r>
-        <w:t xml:space="preserve">, </w:t>
-      </w:r>
-      <w:proofErr w:type="spellStart"/>
-      <w:r>
-        <w:t>Angular</w:t>
-      </w:r>
-      <w:proofErr w:type="spellEnd"/>
-      <w:r>
-        <w:t xml:space="preserve"> </w:t>
-      </w:r>
-      <w:proofErr w:type="spellStart"/>
-      <w:r>
-        <w:t>Material</w:t>
-      </w:r>
-      <w:proofErr w:type="spellEnd"/>
-      <w:r>
-        <w:t xml:space="preserve"> et Plotly.js.</w:t>
+        <w:t>Le module de visualisation (DataViz) est développé en ECMAScript, avec les frameworks Angular, Angular Material et Plotly.js.</w:t>
       </w:r>
     </w:p>
     <w:p>

</xml_diff>

<commit_message>
refactoring play & pause buttons
</commit_message>
<xml_diff>
--- a/apl/doc/apl_cyril.docx
+++ b/apl/doc/apl_cyril.docx
@@ -228,15 +228,25 @@
       <w:r>
         <w:t xml:space="preserve"> situés à une distance inférieure à une valeur de référence (zone de recours). Réciproquement, chaque médecin répond potentiellement à la demande de l’ensemble des habitants situés à une distance inférieure à cette même valeur (zone de patientèle). </w:t>
       </w:r>
+      <w:proofErr w:type="spellStart"/>
       <w:r>
         <w:t>Intègre</w:t>
       </w:r>
       <w:r>
-        <w:t xml:space="preserve">ateur d’accessibilité potentielle localisée se construit donc en deux temps </w:t>
-      </w:r>
+        <w:t>ateur</w:t>
+      </w:r>
+      <w:proofErr w:type="spellEnd"/>
+      <w:r>
+        <w:t xml:space="preserve"> d’accessibilité potentielle localisée se construit donc en deux temps </w:t>
+      </w:r>
+      <w:proofErr w:type="gramStart"/>
       <w:r>
         <w:lastRenderedPageBreak/>
-        <w:t>et intègre un effet de « concurrence » potentiel entre communes</w:t>
+        <w:t>et</w:t>
+      </w:r>
+      <w:proofErr w:type="gramEnd"/>
+      <w:r>
+        <w:t xml:space="preserve"> intègre un effet de « concurrence » potentiel entre communes</w:t>
       </w:r>
       <w:r>
         <w:t xml:space="preserve"> et IRIS</w:t>
@@ -610,11 +620,19 @@
           <w:lang w:val="en-US"/>
         </w:rPr>
       </w:pPr>
+      <w:proofErr w:type="gramStart"/>
       <w:r>
         <w:rPr>
           <w:lang w:val="en-US"/>
         </w:rPr>
-        <w:t xml:space="preserve">URL : </w:t>
+        <w:t>URL :</w:t>
+      </w:r>
+      <w:proofErr w:type="gramEnd"/>
+      <w:r>
+        <w:rPr>
+          <w:lang w:val="en-US"/>
+        </w:rPr>
+        <w:t xml:space="preserve"> </w:t>
       </w:r>
       <w:hyperlink r:id="rId7" w:history="1">
         <w:r>
@@ -686,11 +704,19 @@
           <w:lang w:val="en-US"/>
         </w:rPr>
       </w:pPr>
+      <w:proofErr w:type="gramStart"/>
       <w:r>
         <w:rPr>
           <w:lang w:val="en-US"/>
         </w:rPr>
-        <w:t xml:space="preserve">URL : </w:t>
+        <w:t>URL :</w:t>
+      </w:r>
+      <w:proofErr w:type="gramEnd"/>
+      <w:r>
+        <w:rPr>
+          <w:lang w:val="en-US"/>
+        </w:rPr>
+        <w:t xml:space="preserve"> </w:t>
       </w:r>
       <w:hyperlink r:id="rId8" w:history="1">
         <w:r>
@@ -737,8 +763,30 @@
         <w:rPr>
           <w:rFonts w:eastAsia="Times New Roman"/>
         </w:rPr>
-        <w:t>2.4. OpenStreetMap – Nominatim</w:t>
-      </w:r>
+        <w:t xml:space="preserve">2.4. </w:t>
+      </w:r>
+      <w:proofErr w:type="spellStart"/>
+      <w:r>
+        <w:rPr>
+          <w:rFonts w:eastAsia="Times New Roman"/>
+        </w:rPr>
+        <w:t>OpenStreetMap</w:t>
+      </w:r>
+      <w:proofErr w:type="spellEnd"/>
+      <w:r>
+        <w:rPr>
+          <w:rFonts w:eastAsia="Times New Roman"/>
+        </w:rPr>
+        <w:t xml:space="preserve"> – </w:t>
+      </w:r>
+      <w:proofErr w:type="spellStart"/>
+      <w:r>
+        <w:rPr>
+          <w:rFonts w:eastAsia="Times New Roman"/>
+        </w:rPr>
+        <w:t>Nominatim</w:t>
+      </w:r>
+      <w:proofErr w:type="spellEnd"/>
     </w:p>
     <w:p>
       <w:pPr>
@@ -753,14 +801,24 @@
           <w14:ligatures w14:val="none"/>
         </w:rPr>
       </w:pPr>
-      <w:r>
-        <w:t xml:space="preserve">Nominatim </w:t>
+      <w:proofErr w:type="spellStart"/>
+      <w:r>
+        <w:t>Nominatim</w:t>
+      </w:r>
+      <w:proofErr w:type="spellEnd"/>
+      <w:r>
+        <w:t xml:space="preserve"> </w:t>
       </w:r>
       <w:r>
         <w:t>d’</w:t>
       </w:r>
-      <w:r>
-        <w:t>OpenStreetMap permet de géocoder des adresses et de récupérer des coordonnées GPS à partir de données cartographiques.</w:t>
+      <w:proofErr w:type="spellStart"/>
+      <w:r>
+        <w:t>OpenStreetMap</w:t>
+      </w:r>
+      <w:proofErr w:type="spellEnd"/>
+      <w:r>
+        <w:t xml:space="preserve"> permet de géocoder des adresses et de récupérer des coordonnées GPS à partir de données cartographiques.</w:t>
       </w:r>
     </w:p>
     <w:p>
@@ -770,11 +828,19 @@
           <w:lang w:val="en-US"/>
         </w:rPr>
       </w:pPr>
+      <w:proofErr w:type="gramStart"/>
       <w:r>
         <w:rPr>
           <w:lang w:val="en-US"/>
         </w:rPr>
-        <w:t xml:space="preserve">URL : </w:t>
+        <w:t>URL :</w:t>
+      </w:r>
+      <w:proofErr w:type="gramEnd"/>
+      <w:r>
+        <w:rPr>
+          <w:lang w:val="en-US"/>
+        </w:rPr>
+        <w:t xml:space="preserve"> </w:t>
       </w:r>
       <w:hyperlink r:id="rId9" w:history="1">
         <w:r>
@@ -821,8 +887,16 @@
         <w:rPr>
           <w:rFonts w:eastAsia="Times New Roman"/>
         </w:rPr>
-        <w:t>2.5. Google Maps</w:t>
-      </w:r>
+        <w:t xml:space="preserve">2.5. Google </w:t>
+      </w:r>
+      <w:proofErr w:type="spellStart"/>
+      <w:r>
+        <w:rPr>
+          <w:rFonts w:eastAsia="Times New Roman"/>
+        </w:rPr>
+        <w:t>Maps</w:t>
+      </w:r>
+      <w:proofErr w:type="spellEnd"/>
     </w:p>
     <w:p>
       <w:pPr>
@@ -848,11 +922,19 @@
           <w:lang w:val="en-US"/>
         </w:rPr>
       </w:pPr>
+      <w:proofErr w:type="gramStart"/>
       <w:r>
         <w:rPr>
           <w:lang w:val="en-US"/>
         </w:rPr>
-        <w:t xml:space="preserve">URL : </w:t>
+        <w:t>URL :</w:t>
+      </w:r>
+      <w:proofErr w:type="gramEnd"/>
+      <w:r>
+        <w:rPr>
+          <w:lang w:val="en-US"/>
+        </w:rPr>
+        <w:t xml:space="preserve"> </w:t>
       </w:r>
       <w:hyperlink r:id="rId10" w:history="1">
         <w:r>
@@ -891,9 +973,11 @@
         <w:pStyle w:val="Titre2"/>
         <w:jc w:val="both"/>
       </w:pPr>
+      <w:proofErr w:type="spellStart"/>
       <w:r>
         <w:t>GraphHopper</w:t>
       </w:r>
+      <w:proofErr w:type="spellEnd"/>
     </w:p>
     <w:p>
       <w:pPr>
@@ -909,7 +993,15 @@
         </w:rPr>
       </w:pPr>
       <w:r>
-        <w:t>Fournit toutes les données vectorielles sur les routes et voies d’accès du monde entier, ainsi que les durées de trajet. Planificateur de trajet. Concurrent libre de Google Maps.</w:t>
+        <w:t xml:space="preserve">Fournit toutes les données vectorielles sur les routes et voies d’accès du monde entier, ainsi que les durées de trajet. Planificateur de trajet. Concurrent libre de Google </w:t>
+      </w:r>
+      <w:proofErr w:type="spellStart"/>
+      <w:r>
+        <w:t>Maps</w:t>
+      </w:r>
+      <w:proofErr w:type="spellEnd"/>
+      <w:r>
+        <w:t>.</w:t>
       </w:r>
     </w:p>
     <w:p>
@@ -988,11 +1080,19 @@
           <w:lang w:val="en-US"/>
         </w:rPr>
       </w:pPr>
+      <w:proofErr w:type="gramStart"/>
       <w:r>
         <w:rPr>
           <w:lang w:val="en-US"/>
         </w:rPr>
-        <w:t xml:space="preserve">URL : </w:t>
+        <w:t>URL :</w:t>
+      </w:r>
+      <w:proofErr w:type="gramEnd"/>
+      <w:r>
+        <w:rPr>
+          <w:lang w:val="en-US"/>
+        </w:rPr>
+        <w:t xml:space="preserve"> </w:t>
       </w:r>
       <w:hyperlink r:id="rId12" w:history="1">
         <w:r>
@@ -1187,8 +1287,13 @@
         <w:jc w:val="both"/>
       </w:pPr>
       <w:r>
-        <w:t>INSEE - Filosofi</w:t>
-      </w:r>
+        <w:t xml:space="preserve">INSEE - </w:t>
+      </w:r>
+      <w:proofErr w:type="spellStart"/>
+      <w:r>
+        <w:t>Filosofi</w:t>
+      </w:r>
+      <w:proofErr w:type="spellEnd"/>
     </w:p>
     <w:p>
       <w:pPr>
@@ -1225,11 +1330,19 @@
           <w:lang w:val="en-US"/>
         </w:rPr>
       </w:pPr>
+      <w:proofErr w:type="gramStart"/>
       <w:r>
         <w:rPr>
           <w:lang w:val="en-US"/>
         </w:rPr>
-        <w:t xml:space="preserve">URL : </w:t>
+        <w:t>URL :</w:t>
+      </w:r>
+      <w:proofErr w:type="gramEnd"/>
+      <w:r>
+        <w:rPr>
+          <w:lang w:val="en-US"/>
+        </w:rPr>
+        <w:t xml:space="preserve"> </w:t>
       </w:r>
       <w:hyperlink r:id="rId15" w:history="1">
         <w:r>
@@ -1295,11 +1408,19 @@
           <w:lang w:val="en-US"/>
         </w:rPr>
       </w:pPr>
+      <w:proofErr w:type="gramStart"/>
       <w:r>
         <w:rPr>
           <w:lang w:val="en-US"/>
         </w:rPr>
-        <w:t xml:space="preserve">URL : </w:t>
+        <w:t>URL :</w:t>
+      </w:r>
+      <w:proofErr w:type="gramEnd"/>
+      <w:r>
+        <w:rPr>
+          <w:lang w:val="en-US"/>
+        </w:rPr>
+        <w:t xml:space="preserve"> </w:t>
       </w:r>
       <w:hyperlink r:id="rId16" w:history="1">
         <w:r>
@@ -1367,11 +1488,19 @@
           <w:lang w:val="en-US"/>
         </w:rPr>
       </w:pPr>
+      <w:proofErr w:type="gramStart"/>
       <w:r>
         <w:rPr>
           <w:lang w:val="en-US"/>
         </w:rPr>
-        <w:t xml:space="preserve">URL : </w:t>
+        <w:t>URL :</w:t>
+      </w:r>
+      <w:proofErr w:type="gramEnd"/>
+      <w:r>
+        <w:rPr>
+          <w:lang w:val="en-US"/>
+        </w:rPr>
+        <w:t xml:space="preserve"> </w:t>
       </w:r>
       <w:hyperlink r:id="rId17" w:history="1">
         <w:r>
@@ -1412,8 +1541,13 @@
       <w:pPr>
         <w:pStyle w:val="Titre2"/>
       </w:pPr>
-      <w:r>
-        <w:t>OpenDataSoft – IRIS</w:t>
+      <w:proofErr w:type="spellStart"/>
+      <w:r>
+        <w:t>OpenDataSoft</w:t>
+      </w:r>
+      <w:proofErr w:type="spellEnd"/>
+      <w:r>
+        <w:t xml:space="preserve"> – IRIS</w:t>
       </w:r>
     </w:p>
     <w:p>
@@ -1439,11 +1573,19 @@
           <w:lang w:val="en-US"/>
         </w:rPr>
       </w:pPr>
+      <w:proofErr w:type="gramStart"/>
       <w:r>
         <w:rPr>
           <w:lang w:val="en-US"/>
         </w:rPr>
-        <w:t xml:space="preserve">URL : </w:t>
+        <w:t>URL :</w:t>
+      </w:r>
+      <w:proofErr w:type="gramEnd"/>
+      <w:r>
+        <w:rPr>
+          <w:lang w:val="en-US"/>
+        </w:rPr>
+        <w:t xml:space="preserve"> </w:t>
       </w:r>
       <w:hyperlink r:id="rId18" w:history="1">
         <w:r>
@@ -1648,11 +1790,19 @@
       <w:r>
         <w:t>ANS est donc filtré par mode d’exercice libéral (</w:t>
       </w:r>
+      <w:proofErr w:type="spellStart"/>
       <w:r>
         <w:rPr>
           <w:rFonts w:ascii="Courier New" w:hAnsi="Courier New" w:cs="Courier New"/>
         </w:rPr>
-        <w:t>code_mode_exercice == ‘L’</w:t>
+        <w:t>code_mode_exercice</w:t>
+      </w:r>
+      <w:proofErr w:type="spellEnd"/>
+      <w:r>
+        <w:rPr>
+          <w:rFonts w:ascii="Courier New" w:hAnsi="Courier New" w:cs="Courier New"/>
+        </w:rPr>
+        <w:t xml:space="preserve"> == ‘L’</w:t>
       </w:r>
       <w:r>
         <w:t>) pour le test de cohérence.</w:t>
@@ -1967,12 +2117,14 @@
           <w:numId w:val="25"/>
         </w:numPr>
       </w:pPr>
+      <w:proofErr w:type="spellStart"/>
       <w:r>
         <w:t>Chirurgien-dent</w:t>
       </w:r>
       <w:r>
         <w:t>istes</w:t>
       </w:r>
+      <w:proofErr w:type="spellEnd"/>
     </w:p>
     <w:p>
       <w:pPr>
@@ -2032,9 +2184,11 @@
           <w:numId w:val="22"/>
         </w:numPr>
       </w:pPr>
+      <w:proofErr w:type="spellStart"/>
       <w:r>
         <w:t>Nominatim</w:t>
       </w:r>
+      <w:proofErr w:type="spellEnd"/>
     </w:p>
     <w:p>
       <w:pPr>
@@ -2054,8 +2208,16 @@
         <w:rPr>
           <w:rFonts w:eastAsia="Times New Roman"/>
         </w:rPr>
-        <w:t>Google Maps</w:t>
-      </w:r>
+        <w:t xml:space="preserve">Google </w:t>
+      </w:r>
+      <w:proofErr w:type="spellStart"/>
+      <w:r>
+        <w:rPr>
+          <w:rFonts w:eastAsia="Times New Roman"/>
+        </w:rPr>
+        <w:t>Maps</w:t>
+      </w:r>
+      <w:proofErr w:type="spellEnd"/>
     </w:p>
     <w:p/>
     <w:p>
@@ -2088,7 +2250,15 @@
         </w:rPr>
       </w:pPr>
       <w:r>
-        <w:t>Nous mettons en correspondance l’adresse des PS avec la Base Adresse Nationale (BAN). Si l’adresse est normalisée, la correspondance est directe. Dans le cas contraire, nous utilisons un modèle de rapprochement par motifs (pattern matching) afin d’identifier l’adresse BAN la plus proche. Les coordonnées GPS sont ensuite récupérées.</w:t>
+        <w:t xml:space="preserve">Nous mettons en correspondance l’adresse des PS avec la Base Adresse Nationale (BAN). Si l’adresse est normalisée, la correspondance est directe. Dans le cas contraire, nous utilisons un modèle de rapprochement par motifs (pattern </w:t>
+      </w:r>
+      <w:proofErr w:type="spellStart"/>
+      <w:r>
+        <w:t>matching</w:t>
+      </w:r>
+      <w:proofErr w:type="spellEnd"/>
+      <w:r>
+        <w:t>) afin d’identifier l’adresse BAN la plus proche. Les coordonnées GPS sont ensuite récupérées.</w:t>
       </w:r>
     </w:p>
     <w:p>
@@ -2118,7 +2288,15 @@
       </w:pPr>
       <w:r>
         <w:lastRenderedPageBreak/>
-        <w:t>Pour ce rapprochement, nous utilisons l’algorithme Gestalt ainsi qu’un modèle de machine learning développé en interne, permettant d’identifier les adresses les plus similaires dans environ 90 % des cas.</w:t>
+        <w:t xml:space="preserve">Pour ce rapprochement, nous utilisons l’algorithme Gestalt ainsi qu’un modèle de machine </w:t>
+      </w:r>
+      <w:proofErr w:type="spellStart"/>
+      <w:r>
+        <w:t>learning</w:t>
+      </w:r>
+      <w:proofErr w:type="spellEnd"/>
+      <w:r>
+        <w:t xml:space="preserve"> développé en interne, permettant d’identifier les adresses les plus similaires dans environ 90 % des cas.</w:t>
       </w:r>
     </w:p>
     <w:p/>
@@ -2137,7 +2315,23 @@
         <w:t>la base</w:t>
       </w:r>
       <w:r>
-        <w:t xml:space="preserve"> Nominatim d’OpenStreetMap est </w:t>
+        <w:t xml:space="preserve"> </w:t>
+      </w:r>
+      <w:proofErr w:type="spellStart"/>
+      <w:r>
+        <w:t>Nominatim</w:t>
+      </w:r>
+      <w:proofErr w:type="spellEnd"/>
+      <w:r>
+        <w:t xml:space="preserve"> d’</w:t>
+      </w:r>
+      <w:proofErr w:type="spellStart"/>
+      <w:r>
+        <w:t>OpenStreetMap</w:t>
+      </w:r>
+      <w:proofErr w:type="spellEnd"/>
+      <w:r>
+        <w:t xml:space="preserve"> est </w:t>
       </w:r>
       <w:r>
         <w:t>requêté</w:t>
@@ -2160,7 +2354,15 @@
         </w:rPr>
       </w:pPr>
       <w:r>
-        <w:t>Les rares échecs résiduels sont traités manuellement à l’aide de Google Maps.</w:t>
+        <w:t xml:space="preserve">Les rares échecs résiduels sont traités manuellement à l’aide de Google </w:t>
+      </w:r>
+      <w:proofErr w:type="spellStart"/>
+      <w:r>
+        <w:t>Maps</w:t>
+      </w:r>
+      <w:proofErr w:type="spellEnd"/>
+      <w:r>
+        <w:t>.</w:t>
       </w:r>
     </w:p>
     <w:p/>
@@ -2168,9 +2370,11 @@
       <w:pPr>
         <w:pStyle w:val="Titre2"/>
       </w:pPr>
+      <w:proofErr w:type="spellStart"/>
       <w:r>
         <w:t>GeoIris</w:t>
       </w:r>
+      <w:proofErr w:type="spellEnd"/>
     </w:p>
     <w:p/>
     <w:p>
@@ -2182,13 +2386,42 @@
         </w:rPr>
       </w:pPr>
       <w:r>
-        <w:t>Nous avons développé le programme GeoIris, qui permet, à partir des données « INSEE &amp; IGN – Contours IRIS » et d’une coordonnée GPS, d’identifier l’IRIS correspondant au PS. La marge d’erreur est de 10 mètres. GeoIris repose sur des calculs polygonaux implémentés avec GeoPandas</w:t>
-      </w:r>
+        <w:t xml:space="preserve">Nous avons développé le programme </w:t>
+      </w:r>
+      <w:proofErr w:type="spellStart"/>
+      <w:r>
+        <w:t>GeoIris</w:t>
+      </w:r>
+      <w:proofErr w:type="spellEnd"/>
+      <w:r>
+        <w:t xml:space="preserve">, qui permet, à partir des données « INSEE &amp; IGN – Contours IRIS » et d’une coordonnée GPS, d’identifier l’IRIS correspondant au PS. La marge d’erreur est de 10 mètres. </w:t>
+      </w:r>
+      <w:proofErr w:type="spellStart"/>
+      <w:r>
+        <w:t>GeoIris</w:t>
+      </w:r>
+      <w:proofErr w:type="spellEnd"/>
+      <w:r>
+        <w:t xml:space="preserve"> repose sur des calculs polygonaux implémentés avec </w:t>
+      </w:r>
+      <w:proofErr w:type="spellStart"/>
+      <w:r>
+        <w:t>GeoPandas</w:t>
+      </w:r>
+      <w:proofErr w:type="spellEnd"/>
       <w:r>
         <w:t xml:space="preserve"> </w:t>
       </w:r>
       <w:r>
-        <w:t xml:space="preserve">(GeoDataFrame) : </w:t>
+        <w:t>(</w:t>
+      </w:r>
+      <w:proofErr w:type="spellStart"/>
+      <w:r>
+        <w:t>GeoDataFrame</w:t>
+      </w:r>
+      <w:proofErr w:type="spellEnd"/>
+      <w:r>
+        <w:t xml:space="preserve">) : </w:t>
       </w:r>
       <w:hyperlink r:id="rId20" w:history="1">
         <w:r>
@@ -2224,7 +2457,15 @@
         </w:rPr>
       </w:pPr>
       <w:r>
-        <w:t>Les données de cet outil ont été validées et complétées par la base OpenDataSoft – IRIS.</w:t>
+        <w:t xml:space="preserve">Les données de cet outil ont été validées et complétées par la base </w:t>
+      </w:r>
+      <w:proofErr w:type="spellStart"/>
+      <w:r>
+        <w:t>OpenDataSoft</w:t>
+      </w:r>
+      <w:proofErr w:type="spellEnd"/>
+      <w:r>
+        <w:t xml:space="preserve"> – IRIS.</w:t>
       </w:r>
     </w:p>
     <w:p>
@@ -2256,7 +2497,21 @@
         <w:rPr>
           <w:lang w:val="en-US"/>
         </w:rPr>
-        <w:t>La méthode du Two-step floating catchment area (2SFCA)</w:t>
+        <w:t xml:space="preserve">La </w:t>
+      </w:r>
+      <w:proofErr w:type="spellStart"/>
+      <w:r>
+        <w:rPr>
+          <w:lang w:val="en-US"/>
+        </w:rPr>
+        <w:t>méthode</w:t>
+      </w:r>
+      <w:proofErr w:type="spellEnd"/>
+      <w:r>
+        <w:rPr>
+          <w:lang w:val="en-US"/>
+        </w:rPr>
+        <w:t xml:space="preserve"> du Two-step floating catchment area (2SFCA)</w:t>
       </w:r>
     </w:p>
     <w:p>
@@ -2460,7 +2715,15 @@
         <w:t xml:space="preserve"> de tous les IRIS de France </w:t>
       </w:r>
       <w:r>
-        <w:t>par la base OpenDatasoft – IRIS.</w:t>
+        <w:t xml:space="preserve">par la base </w:t>
+      </w:r>
+      <w:proofErr w:type="spellStart"/>
+      <w:r>
+        <w:t>OpenDatasoft</w:t>
+      </w:r>
+      <w:proofErr w:type="spellEnd"/>
+      <w:r>
+        <w:t xml:space="preserve"> – IRIS.</w:t>
       </w:r>
     </w:p>
     <w:p>
@@ -2593,7 +2856,15 @@
         </w:rPr>
       </w:pPr>
       <w:r>
-        <w:t>Environ 17 millions de durées ont été calculées avec Google Maps (2024).</w:t>
+        <w:t xml:space="preserve">Environ 17 millions de durées ont été calculées avec Google </w:t>
+      </w:r>
+      <w:proofErr w:type="spellStart"/>
+      <w:r>
+        <w:t>Maps</w:t>
+      </w:r>
+      <w:proofErr w:type="spellEnd"/>
+      <w:r>
+        <w:t xml:space="preserve"> (2024).</w:t>
       </w:r>
     </w:p>
     <w:p>
@@ -2605,7 +2876,15 @@
         </w:rPr>
       </w:pPr>
       <w:r>
-        <w:t>Environ 788 millions de durées ont été calculées avec GraphHopper (2025).</w:t>
+        <w:t xml:space="preserve">Environ 788 millions de durées ont été calculées avec </w:t>
+      </w:r>
+      <w:proofErr w:type="spellStart"/>
+      <w:r>
+        <w:t>GraphHopper</w:t>
+      </w:r>
+      <w:proofErr w:type="spellEnd"/>
+      <w:r>
+        <w:t xml:space="preserve"> (2025).</w:t>
       </w:r>
     </w:p>
     <w:p>
@@ -2823,7 +3102,15 @@
         </w:rPr>
       </w:pPr>
       <w:r>
-        <w:t>À partir des données de l’ANS, des cabinets sont associés à chaque PS, puis rattachés à un IRIS à l’aide de l’outil GeoIris.</w:t>
+        <w:t xml:space="preserve">À partir des données de l’ANS, des cabinets sont associés à chaque PS, puis rattachés à un IRIS à l’aide de l’outil </w:t>
+      </w:r>
+      <w:proofErr w:type="spellStart"/>
+      <w:r>
+        <w:t>GeoIris</w:t>
+      </w:r>
+      <w:proofErr w:type="spellEnd"/>
+      <w:r>
+        <w:t>.</w:t>
       </w:r>
     </w:p>
     <w:p/>
@@ -2874,6 +3161,7 @@
     </w:p>
     <w:p/>
     <w:p>
+      <w:proofErr w:type="gramStart"/>
       <w:r>
         <w:rPr>
           <w:rFonts w:ascii="Courier New" w:hAnsi="Courier New" w:cs="Courier New"/>
@@ -2895,12 +3183,14 @@
       <w:r>
         <w:t>:</w:t>
       </w:r>
+      <w:proofErr w:type="gramEnd"/>
       <w:r>
         <w:t xml:space="preserve"> nombre de cabinet</w:t>
       </w:r>
       <w:r>
         <w:t xml:space="preserve"> du </w:t>
       </w:r>
+      <w:proofErr w:type="spellStart"/>
       <w:r>
         <w:rPr>
           <w:rFonts w:ascii="Courier New" w:hAnsi="Courier New" w:cs="Courier New"/>
@@ -2913,6 +3203,7 @@
         </w:rPr>
         <w:t>s</w:t>
       </w:r>
+      <w:proofErr w:type="spellEnd"/>
       <w:r>
         <w:rPr>
           <w:rFonts w:ascii="Courier New" w:hAnsi="Courier New" w:cs="Courier New"/>
@@ -2927,6 +3218,7 @@
       </w:r>
     </w:p>
     <w:p>
+      <w:proofErr w:type="spellStart"/>
       <w:r>
         <w:rPr>
           <w:rFonts w:ascii="Courier New" w:hAnsi="Courier New" w:cs="Courier New"/>
@@ -2939,6 +3231,7 @@
         </w:rPr>
         <w:t>s</w:t>
       </w:r>
+      <w:proofErr w:type="spellEnd"/>
       <w:r>
         <w:t> : l’offre de soins de l’IRIS i</w:t>
       </w:r>
@@ -2971,6 +3264,8 @@
         </w:rPr>
         <w:t>[</w:t>
       </w:r>
+      <w:proofErr w:type="spellStart"/>
+      <w:proofErr w:type="gramStart"/>
       <w:r>
         <w:rPr>
           <w:rFonts w:ascii="Courier New" w:hAnsi="Courier New" w:cs="Courier New"/>
@@ -2978,6 +3273,8 @@
         </w:rPr>
         <w:t>i,s</w:t>
       </w:r>
+      <w:proofErr w:type="spellEnd"/>
+      <w:proofErr w:type="gramEnd"/>
       <w:r>
         <w:rPr>
           <w:rFonts w:ascii="Courier New" w:hAnsi="Courier New" w:cs="Courier New"/>
@@ -2990,22 +3287,49 @@
           <w:rFonts w:ascii="Courier New" w:hAnsi="Courier New" w:cs="Courier New"/>
           <w:lang w:val="en-US"/>
         </w:rPr>
-        <w:t xml:space="preserve"> = np.sum(</w:t>
-      </w:r>
+        <w:t xml:space="preserve"> = </w:t>
+      </w:r>
+      <w:proofErr w:type="spellStart"/>
       <w:r>
         <w:rPr>
           <w:rFonts w:ascii="Courier New" w:hAnsi="Courier New" w:cs="Courier New"/>
           <w:lang w:val="en-US"/>
         </w:rPr>
-        <w:t>1/N[i,j</w:t>
-      </w:r>
+        <w:t>np.sum</w:t>
+      </w:r>
+      <w:proofErr w:type="spellEnd"/>
       <w:r>
         <w:rPr>
           <w:rFonts w:ascii="Courier New" w:hAnsi="Courier New" w:cs="Courier New"/>
           <w:lang w:val="en-US"/>
         </w:rPr>
+        <w:t>(</w:t>
+      </w:r>
+      <w:r>
+        <w:rPr>
+          <w:rFonts w:ascii="Courier New" w:hAnsi="Courier New" w:cs="Courier New"/>
+          <w:lang w:val="en-US"/>
+        </w:rPr>
+        <w:t>1/N[</w:t>
+      </w:r>
+      <w:proofErr w:type="spellStart"/>
+      <w:proofErr w:type="gramStart"/>
+      <w:r>
+        <w:rPr>
+          <w:rFonts w:ascii="Courier New" w:hAnsi="Courier New" w:cs="Courier New"/>
+          <w:lang w:val="en-US"/>
+        </w:rPr>
+        <w:t>i,j</w:t>
+      </w:r>
+      <w:proofErr w:type="gramEnd"/>
+      <w:r>
+        <w:rPr>
+          <w:rFonts w:ascii="Courier New" w:hAnsi="Courier New" w:cs="Courier New"/>
+          <w:lang w:val="en-US"/>
+        </w:rPr>
         <w:t>,s</w:t>
       </w:r>
+      <w:proofErr w:type="spellEnd"/>
       <w:r>
         <w:rPr>
           <w:rFonts w:ascii="Courier New" w:hAnsi="Courier New" w:cs="Courier New"/>
@@ -3192,7 +3516,15 @@
         </w:rPr>
       </w:pPr>
       <w:r>
-        <w:t>Les Drs Vincent et Doe travaillent dans un seul cabinet.</w:t>
+        <w:t xml:space="preserve">Les </w:t>
+      </w:r>
+      <w:proofErr w:type="spellStart"/>
+      <w:r>
+        <w:t>Drs</w:t>
+      </w:r>
+      <w:proofErr w:type="spellEnd"/>
+      <w:r>
+        <w:t xml:space="preserve"> Vincent et Doe travaillent dans un seul cabinet.</w:t>
       </w:r>
     </w:p>
     <w:p>
@@ -4768,12 +5100,28 @@
     </w:p>
     <w:p>
       <w:r>
-        <w:t>L’offre de soins de l’IRIS i est NBi = 1.83 + 1 + 0.83 = 3.67</w:t>
-      </w:r>
-    </w:p>
-    <w:p>
-      <w:r>
-        <w:t>L’offre de soins de l’IRIS j est NBj = 0.33</w:t>
+        <w:t xml:space="preserve">L’offre de soins de l’IRIS i est </w:t>
+      </w:r>
+      <w:proofErr w:type="spellStart"/>
+      <w:r>
+        <w:t>NBi</w:t>
+      </w:r>
+      <w:proofErr w:type="spellEnd"/>
+      <w:r>
+        <w:t xml:space="preserve"> = 1.83 + 1 + 0.83 = 3.67</w:t>
+      </w:r>
+    </w:p>
+    <w:p>
+      <w:r>
+        <w:t xml:space="preserve">L’offre de soins de l’IRIS j est </w:t>
+      </w:r>
+      <w:proofErr w:type="spellStart"/>
+      <w:r>
+        <w:t>NBj</w:t>
+      </w:r>
+      <w:proofErr w:type="spellEnd"/>
+      <w:r>
+        <w:t xml:space="preserve"> = 0.33</w:t>
       </w:r>
     </w:p>
     <w:p/>
@@ -4910,11 +5258,35 @@
       <w:pPr>
         <w:jc w:val="both"/>
       </w:pPr>
+      <w:proofErr w:type="spellStart"/>
       <w:r>
         <w:rPr>
           <w:rFonts w:ascii="Courier New" w:hAnsi="Courier New" w:cs="Courier New"/>
         </w:rPr>
-        <w:t>POPAjustee[i,s]</w:t>
+        <w:t>POPAjustee</w:t>
+      </w:r>
+      <w:proofErr w:type="spellEnd"/>
+      <w:r>
+        <w:rPr>
+          <w:rFonts w:ascii="Courier New" w:hAnsi="Courier New" w:cs="Courier New"/>
+        </w:rPr>
+        <w:t>[</w:t>
+      </w:r>
+      <w:proofErr w:type="spellStart"/>
+      <w:proofErr w:type="gramStart"/>
+      <w:r>
+        <w:rPr>
+          <w:rFonts w:ascii="Courier New" w:hAnsi="Courier New" w:cs="Courier New"/>
+        </w:rPr>
+        <w:t>i,s</w:t>
+      </w:r>
+      <w:proofErr w:type="spellEnd"/>
+      <w:proofErr w:type="gramEnd"/>
+      <w:r>
+        <w:rPr>
+          <w:rFonts w:ascii="Courier New" w:hAnsi="Courier New" w:cs="Courier New"/>
+        </w:rPr>
+        <w:t>]</w:t>
       </w:r>
       <w:r>
         <w:t> : Population ajustée de l’IRISi pour la spécialité s</w:t>
@@ -4924,12 +5296,14 @@
       <w:pPr>
         <w:jc w:val="both"/>
       </w:pPr>
+      <w:proofErr w:type="spellStart"/>
       <w:r>
         <w:rPr>
           <w:rFonts w:ascii="Courier New" w:hAnsi="Courier New" w:cs="Courier New"/>
         </w:rPr>
         <w:t>TRjs</w:t>
       </w:r>
+      <w:proofErr w:type="spellEnd"/>
       <w:r>
         <w:t> : Taux de recours moyen pour la tranche d’âge j et la spécialité s</w:t>
       </w:r>
@@ -4938,6 +5312,7 @@
       <w:pPr>
         <w:jc w:val="both"/>
       </w:pPr>
+      <w:proofErr w:type="spellStart"/>
       <w:r>
         <w:rPr>
           <w:rFonts w:ascii="Courier New" w:hAnsi="Courier New" w:cs="Courier New"/>
@@ -4956,6 +5331,7 @@
         </w:rPr>
         <w:t>ijs</w:t>
       </w:r>
+      <w:proofErr w:type="spellEnd"/>
       <w:r>
         <w:t> : Proportion de la tranche d’âge j pour l’IRIS i et la spécialité s</w:t>
       </w:r>
@@ -4984,26 +5360,87 @@
           <w:rFonts w:ascii="Courier New" w:hAnsi="Courier New" w:cs="Courier New"/>
           <w:lang w:val="en-US"/>
         </w:rPr>
-        <w:t>[i,s] = POP[i] * P</w:t>
-      </w:r>
+        <w:t>[</w:t>
+      </w:r>
+      <w:proofErr w:type="spellStart"/>
+      <w:proofErr w:type="gramStart"/>
       <w:r>
         <w:rPr>
           <w:rFonts w:ascii="Courier New" w:hAnsi="Courier New" w:cs="Courier New"/>
           <w:lang w:val="en-US"/>
         </w:rPr>
-        <w:t>R</w:t>
-      </w:r>
+        <w:t>i,s</w:t>
+      </w:r>
+      <w:proofErr w:type="spellEnd"/>
+      <w:proofErr w:type="gramEnd"/>
       <w:r>
         <w:rPr>
           <w:rFonts w:ascii="Courier New" w:hAnsi="Courier New" w:cs="Courier New"/>
           <w:lang w:val="en-US"/>
         </w:rPr>
-        <w:t>[i,j,s] / TR[</w:t>
-      </w:r>
-      <w:r>
-        <w:rPr>
+        <w:t>] = POP[</w:t>
+      </w:r>
+      <w:proofErr w:type="spellStart"/>
+      <w:r>
+        <w:rPr>
+          <w:rFonts w:ascii="Courier New" w:hAnsi="Courier New" w:cs="Courier New"/>
           <w:lang w:val="en-US"/>
         </w:rPr>
+        <w:t>i</w:t>
+      </w:r>
+      <w:proofErr w:type="spellEnd"/>
+      <w:r>
+        <w:rPr>
+          <w:rFonts w:ascii="Courier New" w:hAnsi="Courier New" w:cs="Courier New"/>
+          <w:lang w:val="en-US"/>
+        </w:rPr>
+        <w:t>] * P</w:t>
+      </w:r>
+      <w:r>
+        <w:rPr>
+          <w:rFonts w:ascii="Courier New" w:hAnsi="Courier New" w:cs="Courier New"/>
+          <w:lang w:val="en-US"/>
+        </w:rPr>
+        <w:t>R</w:t>
+      </w:r>
+      <w:r>
+        <w:rPr>
+          <w:rFonts w:ascii="Courier New" w:hAnsi="Courier New" w:cs="Courier New"/>
+          <w:lang w:val="en-US"/>
+        </w:rPr>
+        <w:t>[</w:t>
+      </w:r>
+      <w:proofErr w:type="spellStart"/>
+      <w:proofErr w:type="gramStart"/>
+      <w:r>
+        <w:rPr>
+          <w:rFonts w:ascii="Courier New" w:hAnsi="Courier New" w:cs="Courier New"/>
+          <w:lang w:val="en-US"/>
+        </w:rPr>
+        <w:t>i,j</w:t>
+      </w:r>
+      <w:proofErr w:type="gramEnd"/>
+      <w:r>
+        <w:rPr>
+          <w:rFonts w:ascii="Courier New" w:hAnsi="Courier New" w:cs="Courier New"/>
+          <w:lang w:val="en-US"/>
+        </w:rPr>
+        <w:t>,s</w:t>
+      </w:r>
+      <w:proofErr w:type="spellEnd"/>
+      <w:r>
+        <w:rPr>
+          <w:rFonts w:ascii="Courier New" w:hAnsi="Courier New" w:cs="Courier New"/>
+          <w:lang w:val="en-US"/>
+        </w:rPr>
+        <w:t>] / TR[</w:t>
+      </w:r>
+      <w:proofErr w:type="spellStart"/>
+      <w:proofErr w:type="gramStart"/>
+      <w:r>
+        <w:rPr>
+          <w:lang w:val="en-US"/>
+        </w:rPr>
         <w:t>j</w:t>
       </w:r>
       <w:r>
@@ -5018,6 +5455,8 @@
         </w:rPr>
         <w:t>s</w:t>
       </w:r>
+      <w:proofErr w:type="spellEnd"/>
+      <w:proofErr w:type="gramEnd"/>
       <w:r>
         <w:rPr>
           <w:lang w:val="en-US"/>
@@ -5497,7 +5936,21 @@
         <w:rPr>
           <w:rFonts w:ascii="Courier New" w:hAnsi="Courier New" w:cs="Courier New"/>
         </w:rPr>
-        <w:t>w(dij)</w:t>
+        <w:t>w(</w:t>
+      </w:r>
+      <w:proofErr w:type="spellStart"/>
+      <w:r>
+        <w:rPr>
+          <w:rFonts w:ascii="Courier New" w:hAnsi="Courier New" w:cs="Courier New"/>
+        </w:rPr>
+        <w:t>dij</w:t>
+      </w:r>
+      <w:proofErr w:type="spellEnd"/>
+      <w:r>
+        <w:rPr>
+          <w:rFonts w:ascii="Courier New" w:hAnsi="Courier New" w:cs="Courier New"/>
+        </w:rPr>
+        <w:t>)</w:t>
       </w:r>
       <w:r>
         <w:t xml:space="preserve"> qui pondère la distance entre les IRIS i et j</w:t>
@@ -5511,12 +5964,14 @@
     </w:p>
     <w:p/>
     <w:p>
+      <w:proofErr w:type="gramStart"/>
       <w:r>
         <w:rPr>
           <w:rFonts w:ascii="Courier New" w:hAnsi="Courier New" w:cs="Courier New"/>
         </w:rPr>
         <w:t>w</w:t>
       </w:r>
+      <w:proofErr w:type="gramEnd"/>
       <w:r>
         <w:rPr>
           <w:rFonts w:ascii="Courier New" w:hAnsi="Courier New" w:cs="Courier New"/>
@@ -5527,24 +5982,78 @@
         <w:rPr>
           <w:rFonts w:ascii="Courier New" w:hAnsi="Courier New" w:cs="Courier New"/>
         </w:rPr>
-        <w:t>[i,j]</w:t>
-      </w:r>
+        <w:t>[</w:t>
+      </w:r>
+      <w:proofErr w:type="spellStart"/>
+      <w:proofErr w:type="gramStart"/>
       <w:r>
         <w:rPr>
           <w:rFonts w:ascii="Courier New" w:hAnsi="Courier New" w:cs="Courier New"/>
         </w:rPr>
-        <w:t>) = np.exp(a * d</w:t>
-      </w:r>
+        <w:t>i,j</w:t>
+      </w:r>
+      <w:proofErr w:type="spellEnd"/>
+      <w:proofErr w:type="gramEnd"/>
       <w:r>
         <w:rPr>
           <w:rFonts w:ascii="Courier New" w:hAnsi="Courier New" w:cs="Courier New"/>
         </w:rPr>
-        <w:t>[i,j]</w:t>
+        <w:t>]</w:t>
       </w:r>
       <w:r>
         <w:rPr>
           <w:rFonts w:ascii="Courier New" w:hAnsi="Courier New" w:cs="Courier New"/>
         </w:rPr>
+        <w:t xml:space="preserve">) = </w:t>
+      </w:r>
+      <w:proofErr w:type="spellStart"/>
+      <w:proofErr w:type="gramStart"/>
+      <w:r>
+        <w:rPr>
+          <w:rFonts w:ascii="Courier New" w:hAnsi="Courier New" w:cs="Courier New"/>
+        </w:rPr>
+        <w:t>np.exp</w:t>
+      </w:r>
+      <w:proofErr w:type="spellEnd"/>
+      <w:r>
+        <w:rPr>
+          <w:rFonts w:ascii="Courier New" w:hAnsi="Courier New" w:cs="Courier New"/>
+        </w:rPr>
+        <w:t>(</w:t>
+      </w:r>
+      <w:proofErr w:type="gramEnd"/>
+      <w:r>
+        <w:rPr>
+          <w:rFonts w:ascii="Courier New" w:hAnsi="Courier New" w:cs="Courier New"/>
+        </w:rPr>
+        <w:t>a * d</w:t>
+      </w:r>
+      <w:r>
+        <w:rPr>
+          <w:rFonts w:ascii="Courier New" w:hAnsi="Courier New" w:cs="Courier New"/>
+        </w:rPr>
+        <w:t>[</w:t>
+      </w:r>
+      <w:proofErr w:type="spellStart"/>
+      <w:proofErr w:type="gramStart"/>
+      <w:r>
+        <w:rPr>
+          <w:rFonts w:ascii="Courier New" w:hAnsi="Courier New" w:cs="Courier New"/>
+        </w:rPr>
+        <w:t>i,j</w:t>
+      </w:r>
+      <w:proofErr w:type="spellEnd"/>
+      <w:proofErr w:type="gramEnd"/>
+      <w:r>
+        <w:rPr>
+          <w:rFonts w:ascii="Courier New" w:hAnsi="Courier New" w:cs="Courier New"/>
+        </w:rPr>
+        <w:t>]</w:t>
+      </w:r>
+      <w:r>
+        <w:rPr>
+          <w:rFonts w:ascii="Courier New" w:hAnsi="Courier New" w:cs="Courier New"/>
+        </w:rPr>
         <w:t>)</w:t>
       </w:r>
       <w:r>
@@ -5563,16 +6072,38 @@
         <w:rPr>
           <w:rFonts w:ascii="Courier New" w:hAnsi="Courier New" w:cs="Courier New"/>
         </w:rPr>
-        <w:t xml:space="preserve"> else 0</w:t>
-      </w:r>
+        <w:t xml:space="preserve"> </w:t>
+      </w:r>
+      <w:proofErr w:type="spellStart"/>
       <w:r>
         <w:rPr>
           <w:rFonts w:ascii="Courier New" w:hAnsi="Courier New" w:cs="Courier New"/>
         </w:rPr>
+        <w:t>else</w:t>
+      </w:r>
+      <w:proofErr w:type="spellEnd"/>
+      <w:r>
+        <w:rPr>
+          <w:rFonts w:ascii="Courier New" w:hAnsi="Courier New" w:cs="Courier New"/>
+        </w:rPr>
+        <w:t xml:space="preserve"> 0</w:t>
+      </w:r>
+      <w:r>
+        <w:rPr>
+          <w:rFonts w:ascii="Courier New" w:hAnsi="Courier New" w:cs="Courier New"/>
+        </w:rPr>
         <w:t xml:space="preserve"> </w:t>
       </w:r>
       <w:r>
-        <w:t>où fa est la fonction d’accessibilité, a une constante négative et d une durée de trajet.</w:t>
+        <w:t xml:space="preserve">où fa est la fonction d’accessibilité, a une constante négative et </w:t>
+      </w:r>
+      <w:proofErr w:type="spellStart"/>
+      <w:r>
+        <w:t>d une</w:t>
+      </w:r>
+      <w:proofErr w:type="spellEnd"/>
+      <w:r>
+        <w:t xml:space="preserve"> durée de trajet.</w:t>
       </w:r>
     </w:p>
     <w:p/>
@@ -6077,11 +6608,16 @@
         <w:t>durée de trajet</w:t>
       </w:r>
       <w:r>
-        <w:t xml:space="preserve"> est inférieure à un seuil de référence d0. On calcule ainsi un ratio Rj</w:t>
+        <w:t xml:space="preserve"> est inférieure à un seuil de référence d0. On calcule ainsi un ratio </w:t>
+      </w:r>
+      <w:proofErr w:type="spellStart"/>
+      <w:r>
+        <w:t>Rj</w:t>
       </w:r>
       <w:r>
         <w:t>s</w:t>
       </w:r>
+      <w:proofErr w:type="spellEnd"/>
       <w:r>
         <w:t xml:space="preserve"> qui rapporte l’offre de </w:t>
       </w:r>
@@ -6145,35 +6681,141 @@
           <w:rFonts w:ascii="Courier New" w:hAnsi="Courier New" w:cs="Courier New"/>
           <w:lang w:val="en-US"/>
         </w:rPr>
-        <w:t>R[j,s] = NB[j,s] / (np.sum(P[i,s][D[i,j] &lt;</w:t>
-      </w:r>
+        <w:t>R[</w:t>
+      </w:r>
+      <w:proofErr w:type="spellStart"/>
+      <w:proofErr w:type="gramStart"/>
       <w:r>
         <w:rPr>
           <w:rFonts w:ascii="Courier New" w:hAnsi="Courier New" w:cs="Courier New"/>
           <w:lang w:val="en-US"/>
         </w:rPr>
-        <w:t>=</w:t>
-      </w:r>
+        <w:t>j,s</w:t>
+      </w:r>
+      <w:proofErr w:type="spellEnd"/>
+      <w:proofErr w:type="gramEnd"/>
       <w:r>
         <w:rPr>
           <w:rFonts w:ascii="Courier New" w:hAnsi="Courier New" w:cs="Courier New"/>
           <w:lang w:val="en-US"/>
         </w:rPr>
-        <w:t xml:space="preserve"> d0] * </w:t>
-      </w:r>
+        <w:t>] = NB[</w:t>
+      </w:r>
+      <w:proofErr w:type="spellStart"/>
+      <w:proofErr w:type="gramStart"/>
       <w:r>
         <w:rPr>
           <w:rFonts w:ascii="Courier New" w:hAnsi="Courier New" w:cs="Courier New"/>
           <w:lang w:val="en-US"/>
         </w:rPr>
-        <w:t>w</w:t>
-      </w:r>
+        <w:t>j,s</w:t>
+      </w:r>
+      <w:proofErr w:type="spellEnd"/>
+      <w:proofErr w:type="gramEnd"/>
       <w:r>
         <w:rPr>
           <w:rFonts w:ascii="Courier New" w:hAnsi="Courier New" w:cs="Courier New"/>
           <w:lang w:val="en-US"/>
         </w:rPr>
-        <w:t>(D[i,j])</w:t>
+        <w:t>] / (</w:t>
+      </w:r>
+      <w:proofErr w:type="spellStart"/>
+      <w:r>
+        <w:rPr>
+          <w:rFonts w:ascii="Courier New" w:hAnsi="Courier New" w:cs="Courier New"/>
+          <w:lang w:val="en-US"/>
+        </w:rPr>
+        <w:t>np.sum</w:t>
+      </w:r>
+      <w:proofErr w:type="spellEnd"/>
+      <w:r>
+        <w:rPr>
+          <w:rFonts w:ascii="Courier New" w:hAnsi="Courier New" w:cs="Courier New"/>
+          <w:lang w:val="en-US"/>
+        </w:rPr>
+        <w:t>(P[</w:t>
+      </w:r>
+      <w:proofErr w:type="spellStart"/>
+      <w:proofErr w:type="gramStart"/>
+      <w:r>
+        <w:rPr>
+          <w:rFonts w:ascii="Courier New" w:hAnsi="Courier New" w:cs="Courier New"/>
+          <w:lang w:val="en-US"/>
+        </w:rPr>
+        <w:t>i,s</w:t>
+      </w:r>
+      <w:proofErr w:type="spellEnd"/>
+      <w:proofErr w:type="gramEnd"/>
+      <w:r>
+        <w:rPr>
+          <w:rFonts w:ascii="Courier New" w:hAnsi="Courier New" w:cs="Courier New"/>
+          <w:lang w:val="en-US"/>
+        </w:rPr>
+        <w:t>][D[</w:t>
+      </w:r>
+      <w:proofErr w:type="spellStart"/>
+      <w:proofErr w:type="gramStart"/>
+      <w:r>
+        <w:rPr>
+          <w:rFonts w:ascii="Courier New" w:hAnsi="Courier New" w:cs="Courier New"/>
+          <w:lang w:val="en-US"/>
+        </w:rPr>
+        <w:t>i,j</w:t>
+      </w:r>
+      <w:proofErr w:type="spellEnd"/>
+      <w:proofErr w:type="gramEnd"/>
+      <w:r>
+        <w:rPr>
+          <w:rFonts w:ascii="Courier New" w:hAnsi="Courier New" w:cs="Courier New"/>
+          <w:lang w:val="en-US"/>
+        </w:rPr>
+        <w:t>] &lt;</w:t>
+      </w:r>
+      <w:r>
+        <w:rPr>
+          <w:rFonts w:ascii="Courier New" w:hAnsi="Courier New" w:cs="Courier New"/>
+          <w:lang w:val="en-US"/>
+        </w:rPr>
+        <w:t>=</w:t>
+      </w:r>
+      <w:r>
+        <w:rPr>
+          <w:rFonts w:ascii="Courier New" w:hAnsi="Courier New" w:cs="Courier New"/>
+          <w:lang w:val="en-US"/>
+        </w:rPr>
+        <w:t xml:space="preserve"> d0] * </w:t>
+      </w:r>
+      <w:r>
+        <w:rPr>
+          <w:rFonts w:ascii="Courier New" w:hAnsi="Courier New" w:cs="Courier New"/>
+          <w:lang w:val="en-US"/>
+        </w:rPr>
+        <w:t>w</w:t>
+      </w:r>
+      <w:r>
+        <w:rPr>
+          <w:rFonts w:ascii="Courier New" w:hAnsi="Courier New" w:cs="Courier New"/>
+          <w:lang w:val="en-US"/>
+        </w:rPr>
+        <w:t>(D[</w:t>
+      </w:r>
+      <w:proofErr w:type="spellStart"/>
+      <w:proofErr w:type="gramStart"/>
+      <w:r>
+        <w:rPr>
+          <w:rFonts w:ascii="Courier New" w:hAnsi="Courier New" w:cs="Courier New"/>
+          <w:lang w:val="en-US"/>
+        </w:rPr>
+        <w:t>i,j</w:t>
+      </w:r>
+      <w:proofErr w:type="spellEnd"/>
+      <w:proofErr w:type="gramEnd"/>
+      <w:r>
+        <w:rPr>
+          <w:rFonts w:ascii="Courier New" w:hAnsi="Courier New" w:cs="Courier New"/>
+          <w:lang w:val="en-US"/>
+        </w:rPr>
+        <w:t>])</w:t>
       </w:r>
     </w:p>
     <w:p>
@@ -6305,6 +6947,7 @@
     </w:p>
     <w:p/>
     <w:p>
+      <w:proofErr w:type="spellStart"/>
       <w:r>
         <w:rPr>
           <w:rFonts w:ascii="Courier New" w:hAnsi="Courier New" w:cs="Courier New"/>
@@ -6312,6 +6955,7 @@
         <w:lastRenderedPageBreak/>
         <w:t>NBjs</w:t>
       </w:r>
+      <w:proofErr w:type="spellEnd"/>
       <w:r>
         <w:t xml:space="preserve"> mesure l’offre de soins dans l’IRIS j et la spécialité s</w:t>
       </w:r>
@@ -6331,28 +6975,46 @@
       </w:r>
     </w:p>
     <w:p>
+      <w:proofErr w:type="spellStart"/>
       <w:r>
         <w:rPr>
           <w:rFonts w:ascii="Courier New" w:hAnsi="Courier New" w:cs="Courier New"/>
         </w:rPr>
         <w:t>Dij</w:t>
       </w:r>
+      <w:proofErr w:type="spellEnd"/>
       <w:r>
         <w:t xml:space="preserve"> mesure la distance entre les IRIS i et j.</w:t>
       </w:r>
     </w:p>
     <w:p>
+      <w:proofErr w:type="gramStart"/>
       <w:r>
         <w:rPr>
           <w:rFonts w:ascii="Courier New" w:hAnsi="Courier New" w:cs="Courier New"/>
         </w:rPr>
         <w:t>w</w:t>
       </w:r>
+      <w:proofErr w:type="gramEnd"/>
       <w:r>
         <w:rPr>
           <w:rFonts w:ascii="Courier New" w:hAnsi="Courier New" w:cs="Courier New"/>
         </w:rPr>
-        <w:t>(Dij)</w:t>
+        <w:t>(</w:t>
+      </w:r>
+      <w:proofErr w:type="spellStart"/>
+      <w:r>
+        <w:rPr>
+          <w:rFonts w:ascii="Courier New" w:hAnsi="Courier New" w:cs="Courier New"/>
+        </w:rPr>
+        <w:t>Dij</w:t>
+      </w:r>
+      <w:proofErr w:type="spellEnd"/>
+      <w:r>
+        <w:rPr>
+          <w:rFonts w:ascii="Courier New" w:hAnsi="Courier New" w:cs="Courier New"/>
+        </w:rPr>
+        <w:t>)</w:t>
       </w:r>
       <w:r>
         <w:t xml:space="preserve"> est la pondération relative à la distance.</w:t>
@@ -6426,7 +7088,75 @@
           <w:rFonts w:ascii="Courier New" w:hAnsi="Courier New" w:cs="Courier New"/>
           <w:lang w:val="en-US"/>
         </w:rPr>
-        <w:t>APL[i,s] = np.sum(Rjs[Dij &lt;</w:t>
+        <w:t>APL[</w:t>
+      </w:r>
+      <w:proofErr w:type="spellStart"/>
+      <w:proofErr w:type="gramStart"/>
+      <w:r>
+        <w:rPr>
+          <w:rFonts w:ascii="Courier New" w:hAnsi="Courier New" w:cs="Courier New"/>
+          <w:lang w:val="en-US"/>
+        </w:rPr>
+        <w:t>i,s</w:t>
+      </w:r>
+      <w:proofErr w:type="spellEnd"/>
+      <w:proofErr w:type="gramEnd"/>
+      <w:r>
+        <w:rPr>
+          <w:rFonts w:ascii="Courier New" w:hAnsi="Courier New" w:cs="Courier New"/>
+          <w:lang w:val="en-US"/>
+        </w:rPr>
+        <w:t xml:space="preserve">] = </w:t>
+      </w:r>
+      <w:proofErr w:type="spellStart"/>
+      <w:proofErr w:type="gramStart"/>
+      <w:r>
+        <w:rPr>
+          <w:rFonts w:ascii="Courier New" w:hAnsi="Courier New" w:cs="Courier New"/>
+          <w:lang w:val="en-US"/>
+        </w:rPr>
+        <w:t>np.sum</w:t>
+      </w:r>
+      <w:proofErr w:type="spellEnd"/>
+      <w:r>
+        <w:rPr>
+          <w:rFonts w:ascii="Courier New" w:hAnsi="Courier New" w:cs="Courier New"/>
+          <w:lang w:val="en-US"/>
+        </w:rPr>
+        <w:t>(</w:t>
+      </w:r>
+      <w:proofErr w:type="spellStart"/>
+      <w:r>
+        <w:rPr>
+          <w:rFonts w:ascii="Courier New" w:hAnsi="Courier New" w:cs="Courier New"/>
+          <w:lang w:val="en-US"/>
+        </w:rPr>
+        <w:t>Rjs</w:t>
+      </w:r>
+      <w:proofErr w:type="spellEnd"/>
+      <w:r>
+        <w:rPr>
+          <w:rFonts w:ascii="Courier New" w:hAnsi="Courier New" w:cs="Courier New"/>
+          <w:lang w:val="en-US"/>
+        </w:rPr>
+        <w:t>[</w:t>
+      </w:r>
+      <w:proofErr w:type="spellStart"/>
+      <w:proofErr w:type="gramEnd"/>
+      <w:r>
+        <w:rPr>
+          <w:rFonts w:ascii="Courier New" w:hAnsi="Courier New" w:cs="Courier New"/>
+          <w:lang w:val="en-US"/>
+        </w:rPr>
+        <w:t>Dij</w:t>
+      </w:r>
+      <w:proofErr w:type="spellEnd"/>
+      <w:r>
+        <w:rPr>
+          <w:rFonts w:ascii="Courier New" w:hAnsi="Courier New" w:cs="Courier New"/>
+          <w:lang w:val="en-US"/>
+        </w:rPr>
+        <w:t xml:space="preserve"> &lt;</w:t>
       </w:r>
       <w:r>
         <w:rPr>
@@ -6524,12 +7254,14 @@
           <w:lang w:val="en-US"/>
         </w:rPr>
       </w:pPr>
+      <w:proofErr w:type="spellStart"/>
       <w:r>
         <w:rPr>
           <w:lang w:val="en-US"/>
         </w:rPr>
         <w:t>GeoDataViz</w:t>
       </w:r>
+      <w:proofErr w:type="spellEnd"/>
     </w:p>
     <w:p>
       <w:pPr>
@@ -6747,7 +7479,15 @@
       </w:pPr>
       <w:r>
         <w:lastRenderedPageBreak/>
-        <w:t>Les données de la base Filosofi sont ensuite intégrées.</w:t>
+        <w:t xml:space="preserve">Les données de la base </w:t>
+      </w:r>
+      <w:proofErr w:type="spellStart"/>
+      <w:r>
+        <w:t>Filosofi</w:t>
+      </w:r>
+      <w:proofErr w:type="spellEnd"/>
+      <w:r>
+        <w:t xml:space="preserve"> sont ensuite intégrées.</w:t>
       </w:r>
     </w:p>
     <w:p>
@@ -6767,7 +7507,15 @@
         </w:rPr>
       </w:pPr>
       <w:r>
-        <w:t>Détail d’un IRIS pour les généralistes sur la commune de Nice en 2025, pour D0 = 30 minutes et a = -0.12, complété par les données Filosofi.</w:t>
+        <w:t xml:space="preserve">Détail d’un IRIS pour les généralistes sur la commune de Nice en 2025, pour D0 = 30 minutes et a = -0.12, complété par les données </w:t>
+      </w:r>
+      <w:proofErr w:type="spellStart"/>
+      <w:r>
+        <w:t>Filosofi</w:t>
+      </w:r>
+      <w:proofErr w:type="spellEnd"/>
+      <w:r>
+        <w:t>.</w:t>
       </w:r>
     </w:p>
     <w:p/>
@@ -6952,11 +7700,27 @@
         </w:rPr>
         <w:t xml:space="preserve">Constante de la fonction de décroissance : il s’agit de la constante a de la fonction </w:t>
       </w:r>
+      <w:proofErr w:type="spellStart"/>
+      <w:proofErr w:type="gramStart"/>
       <w:r>
         <w:rPr>
           <w:rFonts w:eastAsia="Times New Roman"/>
         </w:rPr>
-        <w:t>exp(a * x)</w:t>
+        <w:t>exp</w:t>
+      </w:r>
+      <w:proofErr w:type="spellEnd"/>
+      <w:r>
+        <w:rPr>
+          <w:rFonts w:eastAsia="Times New Roman"/>
+        </w:rPr>
+        <w:t>(</w:t>
+      </w:r>
+      <w:proofErr w:type="gramEnd"/>
+      <w:r>
+        <w:rPr>
+          <w:rFonts w:eastAsia="Times New Roman"/>
+        </w:rPr>
+        <w:t>a * x)</w:t>
       </w:r>
       <w:r>
         <w:rPr>
@@ -7313,7 +8077,31 @@
         </w:rPr>
       </w:pPr>
       <w:r>
-        <w:t>Les calculs sont effectués en Python, avec les bibliothèques Pandas, GeoPandas, NumPy et scikit-learn.</w:t>
+        <w:t xml:space="preserve">Les calculs sont effectués en Python, avec les bibliothèques Pandas, </w:t>
+      </w:r>
+      <w:proofErr w:type="spellStart"/>
+      <w:r>
+        <w:t>GeoPandas</w:t>
+      </w:r>
+      <w:proofErr w:type="spellEnd"/>
+      <w:r>
+        <w:t xml:space="preserve">, </w:t>
+      </w:r>
+      <w:proofErr w:type="spellStart"/>
+      <w:r>
+        <w:t>NumPy</w:t>
+      </w:r>
+      <w:proofErr w:type="spellEnd"/>
+      <w:r>
+        <w:t xml:space="preserve"> et </w:t>
+      </w:r>
+      <w:proofErr w:type="spellStart"/>
+      <w:r>
+        <w:t>scikit-learn</w:t>
+      </w:r>
+      <w:proofErr w:type="spellEnd"/>
+      <w:r>
+        <w:t>.</w:t>
       </w:r>
     </w:p>
     <w:p>
@@ -7338,7 +8126,55 @@
       </w:pPr>
       <w:r>
         <w:lastRenderedPageBreak/>
-        <w:t>Le module de visualisation (DataViz) est développé en ECMAScript, avec les frameworks Angular, Angular Material et Plotly.js.</w:t>
+        <w:t>Le module de visualisation (</w:t>
+      </w:r>
+      <w:proofErr w:type="spellStart"/>
+      <w:r>
+        <w:t>DataViz</w:t>
+      </w:r>
+      <w:proofErr w:type="spellEnd"/>
+      <w:r>
+        <w:t xml:space="preserve">) est développé en </w:t>
+      </w:r>
+      <w:proofErr w:type="spellStart"/>
+      <w:r>
+        <w:t>ECMAScript</w:t>
+      </w:r>
+      <w:proofErr w:type="spellEnd"/>
+      <w:r>
+        <w:t xml:space="preserve">, avec les </w:t>
+      </w:r>
+      <w:proofErr w:type="spellStart"/>
+      <w:r>
+        <w:t>frameworks</w:t>
+      </w:r>
+      <w:proofErr w:type="spellEnd"/>
+      <w:r>
+        <w:t xml:space="preserve"> </w:t>
+      </w:r>
+      <w:proofErr w:type="spellStart"/>
+      <w:r>
+        <w:t>Angular</w:t>
+      </w:r>
+      <w:proofErr w:type="spellEnd"/>
+      <w:r>
+        <w:t xml:space="preserve">, </w:t>
+      </w:r>
+      <w:proofErr w:type="spellStart"/>
+      <w:r>
+        <w:t>Angular</w:t>
+      </w:r>
+      <w:proofErr w:type="spellEnd"/>
+      <w:r>
+        <w:t xml:space="preserve"> </w:t>
+      </w:r>
+      <w:proofErr w:type="spellStart"/>
+      <w:r>
+        <w:t>Material</w:t>
+      </w:r>
+      <w:proofErr w:type="spellEnd"/>
+      <w:r>
+        <w:t xml:space="preserve"> et Plotly.js.</w:t>
       </w:r>
     </w:p>
     <w:p>

</xml_diff>